<commit_message>
docs: add process documentation and demo video link
</commit_message>
<xml_diff>
--- a/docs/process/process-documentation.docx
+++ b/docs/process/process-documentation.docx
@@ -23,7 +23,18 @@
         <w:rPr>
           <w:rFonts w:ascii="Microsoft YaHei" w:hAnsi="Microsoft YaHei"/>
         </w:rPr>
-        <w:t>一、项目概述</w:t>
+        <w:t>一、目标描述</w:t>
+      </w:r>
+    </w:p>
+    <w:p>
+      <w:pPr>
+        <w:pStyle w:val="Heading2"/>
+      </w:pPr>
+      <w:r>
+        <w:rPr>
+          <w:rFonts w:ascii="Microsoft YaHei" w:hAnsi="Microsoft YaHei"/>
+        </w:rPr>
+        <w:t>1.1 项目目标</w:t>
       </w:r>
     </w:p>
     <w:p>
@@ -34,7 +45,18 @@
           <w:i w:val="0"/>
           <w:sz w:val="22"/>
         </w:rPr>
-        <w:t>项目名称：rjs_lite —— 面向 AI Agent 的轻量级 JavaScript 执行 Runtime</w:t>
+        <w:t>本项目参加"面向 AI Agent 的轻量级执行引擎"赛题，目标是构建一个轻量、可嵌入、零外部依赖的 JavaScript 执行 Runtime，专为 AI Agent 工作流中的短生命周期、高频本地工具调用场景设计。</w:t>
+      </w:r>
+    </w:p>
+    <w:p>
+      <w:pPr>
+        <w:pStyle w:val="Heading2"/>
+      </w:pPr>
+      <w:r>
+        <w:rPr>
+          <w:rFonts w:ascii="Microsoft YaHei" w:hAnsi="Microsoft YaHei"/>
+        </w:rPr>
+        <w:t>1.2 核心目标</w:t>
       </w:r>
     </w:p>
     <w:p>
@@ -45,7 +67,7 @@
           <w:i w:val="0"/>
           <w:sz w:val="22"/>
         </w:rPr>
-        <w:t>项目类型：Rust 原生 JavaScript 子集引擎（非套壳实现）</w:t>
+        <w:t>1. 建立原生 JS 引擎核心架构（lexer → parser → AST → interpreter）</w:t>
       </w:r>
     </w:p>
     <w:p>
@@ -56,7 +78,7 @@
           <w:i w:val="0"/>
           <w:sz w:val="22"/>
         </w:rPr>
-        <w:t>版本：0.1.0</w:t>
+        <w:t>2. 支持基础 JS 语法执行，能通过自带单元测试和 CLI 测试</w:t>
       </w:r>
     </w:p>
     <w:p>
@@ -67,7 +89,73 @@
           <w:i w:val="0"/>
           <w:sz w:val="22"/>
         </w:rPr>
-        <w:t>技术栈：Rust（edition 2024），零外部依赖</w:t>
+        <w:t>3. 提供 Agent 可直接消费的结构化 JSON 执行结果</w:t>
+      </w:r>
+    </w:p>
+    <w:p>
+      <w:r>
+        <w:rPr>
+          <w:rFonts w:ascii="Microsoft YaHei" w:hAnsi="Microsoft YaHei"/>
+          <w:b w:val="0"/>
+          <w:i w:val="0"/>
+          <w:sz w:val="22"/>
+        </w:rPr>
+        <w:t>4. 为 test262 接入、标准库和性能优化预留清晰演进路线</w:t>
+      </w:r>
+    </w:p>
+    <w:p>
+      <w:pPr>
+        <w:pStyle w:val="Heading2"/>
+      </w:pPr>
+      <w:r>
+        <w:rPr>
+          <w:rFonts w:ascii="Microsoft YaHei" w:hAnsi="Microsoft YaHei"/>
+        </w:rPr>
+        <w:t>1.3 成功标准</w:t>
+      </w:r>
+    </w:p>
+    <w:p>
+      <w:r>
+        <w:rPr>
+          <w:rFonts w:ascii="Microsoft YaHei" w:hAnsi="Microsoft YaHei"/>
+          <w:b w:val="0"/>
+          <w:i w:val="0"/>
+          <w:sz w:val="22"/>
+        </w:rPr>
+        <w:t>• 不依赖任何第三方 JS 引擎（非套壳）</w:t>
+      </w:r>
+    </w:p>
+    <w:p>
+      <w:r>
+        <w:rPr>
+          <w:rFonts w:ascii="Microsoft YaHei" w:hAnsi="Microsoft YaHei"/>
+          <w:b w:val="0"/>
+          <w:i w:val="0"/>
+          <w:sz w:val="22"/>
+        </w:rPr>
+        <w:t>• 不依赖任何第三方 Rust crate</w:t>
+      </w:r>
+    </w:p>
+    <w:p>
+      <w:r>
+        <w:rPr>
+          <w:rFonts w:ascii="Microsoft YaHei" w:hAnsi="Microsoft YaHei"/>
+          <w:b w:val="0"/>
+          <w:i w:val="0"/>
+          <w:sz w:val="22"/>
+        </w:rPr>
+        <w:t>• 通过自有单元测试覆盖核心功能</w:t>
+      </w:r>
+    </w:p>
+    <w:p>
+      <w:r>
+        <w:rPr>
+          <w:rFonts w:ascii="Microsoft YaHei" w:hAnsi="Microsoft YaHei"/>
+          <w:b w:val="0"/>
+          <w:i w:val="0"/>
+          <w:sz w:val="22"/>
+        </w:rPr>
+        <w:t>• Agent 工具模式输出稳定 JSON 结果</w:t>
       </w:r>
     </w:p>
     <w:p>
@@ -78,7 +166,7 @@
         <w:rPr>
           <w:rFonts w:ascii="Microsoft YaHei" w:hAnsi="Microsoft YaHei"/>
         </w:rPr>
-        <w:t>二、设计思路</w:t>
+        <w:t>二、比赛题目分析和相关资料调研</w:t>
       </w:r>
     </w:p>
     <w:p>
@@ -89,7 +177,7 @@
         <w:rPr>
           <w:rFonts w:ascii="Microsoft YaHei" w:hAnsi="Microsoft YaHei"/>
         </w:rPr>
-        <w:t>2.1 项目定位</w:t>
+        <w:t>2.1 赛题解读</w:t>
       </w:r>
     </w:p>
     <w:p>
@@ -100,7 +188,51 @@
           <w:i w:val="0"/>
           <w:sz w:val="22"/>
         </w:rPr>
-        <w:t>赛题名称为"面向 AI Agent 的轻量级执行引擎"。本项目的核心理解是：为 AI Agent 提供一个本地、轻量、可嵌入的 JavaScript 执行工具，让 Agent 可以将临时脚本交给 Runtime 执行，并获得结构化结果。</w:t>
+        <w:t>赛题要求实现一个"面向 AI Agent 的轻量级执行引擎"。核心需求分析：</w:t>
+      </w:r>
+    </w:p>
+    <w:p>
+      <w:r>
+        <w:rPr>
+          <w:rFonts w:ascii="Microsoft YaHei" w:hAnsi="Microsoft YaHei"/>
+          <w:b w:val="0"/>
+          <w:i w:val="0"/>
+          <w:sz w:val="22"/>
+        </w:rPr>
+        <w:t>• 轻量级：启动快、占用小、无外部依赖</w:t>
+      </w:r>
+    </w:p>
+    <w:p>
+      <w:r>
+        <w:rPr>
+          <w:rFonts w:ascii="Microsoft YaHei" w:hAnsi="Microsoft YaHei"/>
+          <w:b w:val="0"/>
+          <w:i w:val="0"/>
+          <w:sz w:val="22"/>
+        </w:rPr>
+        <w:t>• Agent 友好：输出结构化结果，便于 Agent 解析和处理</w:t>
+      </w:r>
+    </w:p>
+    <w:p>
+      <w:r>
+        <w:rPr>
+          <w:rFonts w:ascii="Microsoft YaHei" w:hAnsi="Microsoft YaHei"/>
+          <w:b w:val="0"/>
+          <w:i w:val="0"/>
+          <w:sz w:val="22"/>
+        </w:rPr>
+        <w:t>• 可嵌入：能作为库或 CLI 工具被程序调用</w:t>
+      </w:r>
+    </w:p>
+    <w:p>
+      <w:r>
+        <w:rPr>
+          <w:rFonts w:ascii="Microsoft YaHei" w:hAnsi="Microsoft YaHei"/>
+          <w:b w:val="0"/>
+          <w:i w:val="0"/>
+          <w:sz w:val="22"/>
+        </w:rPr>
+        <w:t>• 安全可控：具备资源限制机制，防止失控脚本</w:t>
       </w:r>
     </w:p>
     <w:p>
@@ -111,7 +243,268 @@
         <w:rPr>
           <w:rFonts w:ascii="Microsoft YaHei" w:hAnsi="Microsoft YaHei"/>
         </w:rPr>
-        <w:t>2.2 核心架构设计</w:t>
+        <w:t>2.2 技术选型调研</w:t>
+      </w:r>
+    </w:p>
+    <w:tbl>
+      <w:tblPr>
+        <w:tblStyle w:val="LightGrid-Accent1"/>
+        <w:tblW w:type="auto" w:w="0"/>
+        <w:jc w:val="center"/>
+        <w:tblLook w:firstColumn="1" w:firstRow="1" w:lastColumn="0" w:lastRow="0" w:noHBand="0" w:noVBand="1" w:val="04A0"/>
+      </w:tblPr>
+      <w:tblGrid>
+        <w:gridCol w:w="2351"/>
+        <w:gridCol w:w="2351"/>
+        <w:gridCol w:w="2351"/>
+        <w:gridCol w:w="2351"/>
+      </w:tblGrid>
+      <w:tr>
+        <w:tc>
+          <w:tcPr>
+            <w:tcW w:type="dxa" w:w="2351"/>
+          </w:tcPr>
+          <w:p>
+            <w:r>
+              <w:rPr>
+                <w:rFonts w:ascii="Microsoft YaHei" w:hAnsi="Microsoft YaHei"/>
+                <w:b/>
+                <w:sz w:val="20"/>
+              </w:rPr>
+              <w:t>方案</w:t>
+            </w:r>
+          </w:p>
+        </w:tc>
+        <w:tc>
+          <w:tcPr>
+            <w:tcW w:type="dxa" w:w="2351"/>
+          </w:tcPr>
+          <w:p>
+            <w:r>
+              <w:rPr>
+                <w:rFonts w:ascii="Microsoft YaHei" w:hAnsi="Microsoft YaHei"/>
+                <w:b/>
+                <w:sz w:val="20"/>
+              </w:rPr>
+              <w:t>优势</w:t>
+            </w:r>
+          </w:p>
+        </w:tc>
+        <w:tc>
+          <w:tcPr>
+            <w:tcW w:type="dxa" w:w="2351"/>
+          </w:tcPr>
+          <w:p>
+            <w:r>
+              <w:rPr>
+                <w:rFonts w:ascii="Microsoft YaHei" w:hAnsi="Microsoft YaHei"/>
+                <w:b/>
+                <w:sz w:val="20"/>
+              </w:rPr>
+              <w:t>劣势</w:t>
+            </w:r>
+          </w:p>
+        </w:tc>
+        <w:tc>
+          <w:tcPr>
+            <w:tcW w:type="dxa" w:w="2351"/>
+          </w:tcPr>
+          <w:p>
+            <w:r>
+              <w:rPr>
+                <w:rFonts w:ascii="Microsoft YaHei" w:hAnsi="Microsoft YaHei"/>
+                <w:b/>
+                <w:sz w:val="20"/>
+              </w:rPr>
+              <w:t>结论</w:t>
+            </w:r>
+          </w:p>
+        </w:tc>
+      </w:tr>
+      <w:tr>
+        <w:tc>
+          <w:tcPr>
+            <w:tcW w:type="dxa" w:w="2351"/>
+          </w:tcPr>
+          <w:p>
+            <w:r>
+              <w:rPr>
+                <w:rFonts w:ascii="Microsoft YaHei" w:hAnsi="Microsoft YaHei"/>
+                <w:sz w:val="20"/>
+              </w:rPr>
+              <w:t>套壳 V8/QuickJS</w:t>
+            </w:r>
+          </w:p>
+        </w:tc>
+        <w:tc>
+          <w:tcPr>
+            <w:tcW w:type="dxa" w:w="2351"/>
+          </w:tcPr>
+          <w:p>
+            <w:r>
+              <w:rPr>
+                <w:rFonts w:ascii="Microsoft YaHei" w:hAnsi="Microsoft YaHei"/>
+                <w:sz w:val="20"/>
+              </w:rPr>
+              <w:t>兼容性好</w:t>
+            </w:r>
+          </w:p>
+        </w:tc>
+        <w:tc>
+          <w:tcPr>
+            <w:tcW w:type="dxa" w:w="2351"/>
+          </w:tcPr>
+          <w:p>
+            <w:r>
+              <w:rPr>
+                <w:rFonts w:ascii="Microsoft YaHei" w:hAnsi="Microsoft YaHei"/>
+                <w:sz w:val="20"/>
+              </w:rPr>
+              <w:t>包体大、依赖重</w:t>
+            </w:r>
+          </w:p>
+        </w:tc>
+        <w:tc>
+          <w:tcPr>
+            <w:tcW w:type="dxa" w:w="2351"/>
+          </w:tcPr>
+          <w:p>
+            <w:r>
+              <w:rPr>
+                <w:rFonts w:ascii="Microsoft YaHei" w:hAnsi="Microsoft YaHei"/>
+                <w:sz w:val="20"/>
+              </w:rPr>
+              <w:t>不采用</w:t>
+            </w:r>
+          </w:p>
+        </w:tc>
+      </w:tr>
+      <w:tr>
+        <w:tc>
+          <w:tcPr>
+            <w:tcW w:type="dxa" w:w="2351"/>
+          </w:tcPr>
+          <w:p>
+            <w:r>
+              <w:rPr>
+                <w:rFonts w:ascii="Microsoft YaHei" w:hAnsi="Microsoft YaHei"/>
+                <w:sz w:val="20"/>
+              </w:rPr>
+              <w:t>套壳 Node.js</w:t>
+            </w:r>
+          </w:p>
+        </w:tc>
+        <w:tc>
+          <w:tcPr>
+            <w:tcW w:type="dxa" w:w="2351"/>
+          </w:tcPr>
+          <w:p>
+            <w:r>
+              <w:rPr>
+                <w:rFonts w:ascii="Microsoft YaHei" w:hAnsi="Microsoft YaHei"/>
+                <w:sz w:val="20"/>
+              </w:rPr>
+              <w:t>功能完整</w:t>
+            </w:r>
+          </w:p>
+        </w:tc>
+        <w:tc>
+          <w:tcPr>
+            <w:tcW w:type="dxa" w:w="2351"/>
+          </w:tcPr>
+          <w:p>
+            <w:r>
+              <w:rPr>
+                <w:rFonts w:ascii="Microsoft YaHei" w:hAnsi="Microsoft YaHei"/>
+                <w:sz w:val="20"/>
+              </w:rPr>
+              <w:t>启动慢、依赖重</w:t>
+            </w:r>
+          </w:p>
+        </w:tc>
+        <w:tc>
+          <w:tcPr>
+            <w:tcW w:type="dxa" w:w="2351"/>
+          </w:tcPr>
+          <w:p>
+            <w:r>
+              <w:rPr>
+                <w:rFonts w:ascii="Microsoft YaHei" w:hAnsi="Microsoft YaHei"/>
+                <w:sz w:val="20"/>
+              </w:rPr>
+              <w:t>不采用</w:t>
+            </w:r>
+          </w:p>
+        </w:tc>
+      </w:tr>
+      <w:tr>
+        <w:tc>
+          <w:tcPr>
+            <w:tcW w:type="dxa" w:w="2351"/>
+          </w:tcPr>
+          <w:p>
+            <w:r>
+              <w:rPr>
+                <w:rFonts w:ascii="Microsoft YaHei" w:hAnsi="Microsoft YaHei"/>
+                <w:sz w:val="20"/>
+              </w:rPr>
+              <w:t>自研 Rust 引擎</w:t>
+            </w:r>
+          </w:p>
+        </w:tc>
+        <w:tc>
+          <w:tcPr>
+            <w:tcW w:type="dxa" w:w="2351"/>
+          </w:tcPr>
+          <w:p>
+            <w:r>
+              <w:rPr>
+                <w:rFonts w:ascii="Microsoft YaHei" w:hAnsi="Microsoft YaHei"/>
+                <w:sz w:val="20"/>
+              </w:rPr>
+              <w:t>轻量、零依赖、可控</w:t>
+            </w:r>
+          </w:p>
+        </w:tc>
+        <w:tc>
+          <w:tcPr>
+            <w:tcW w:type="dxa" w:w="2351"/>
+          </w:tcPr>
+          <w:p>
+            <w:r>
+              <w:rPr>
+                <w:rFonts w:ascii="Microsoft YaHei" w:hAnsi="Microsoft YaHei"/>
+                <w:sz w:val="20"/>
+              </w:rPr>
+              <w:t>开发工作量大</w:t>
+            </w:r>
+          </w:p>
+        </w:tc>
+        <w:tc>
+          <w:tcPr>
+            <w:tcW w:type="dxa" w:w="2351"/>
+          </w:tcPr>
+          <w:p>
+            <w:r>
+              <w:rPr>
+                <w:rFonts w:ascii="Microsoft YaHei" w:hAnsi="Microsoft YaHei"/>
+                <w:sz w:val="20"/>
+              </w:rPr>
+              <w:t>采用</w:t>
+            </w:r>
+          </w:p>
+        </w:tc>
+      </w:tr>
+    </w:tbl>
+    <w:p>
+      <w:pPr>
+        <w:pStyle w:val="Heading2"/>
+      </w:pPr>
+      <w:r>
+        <w:rPr>
+          <w:rFonts w:ascii="Microsoft YaHei" w:hAnsi="Microsoft YaHei"/>
+        </w:rPr>
+        <w:t>2.3 参考资料</w:t>
       </w:r>
     </w:p>
     <w:p>
@@ -120,6 +513,72 @@
           <w:rFonts w:ascii="Microsoft YaHei" w:hAnsi="Microsoft YaHei"/>
           <w:b w:val="0"/>
           <w:i w:val="0"/>
+          <w:sz w:val="22"/>
+        </w:rPr>
+        <w:t>• ECMAScript 语言规范（ECMA-262）：JavaScript 语义参考标准</w:t>
+      </w:r>
+    </w:p>
+    <w:p>
+      <w:r>
+        <w:rPr>
+          <w:rFonts w:ascii="Microsoft YaHei" w:hAnsi="Microsoft YaHei"/>
+          <w:b w:val="0"/>
+          <w:i w:val="0"/>
+          <w:sz w:val="22"/>
+        </w:rPr>
+        <w:t>• test262 测试套件：ECMAScript 官方一致性测试集</w:t>
+      </w:r>
+    </w:p>
+    <w:p>
+      <w:r>
+        <w:rPr>
+          <w:rFonts w:ascii="Microsoft YaHei" w:hAnsi="Microsoft YaHei"/>
+          <w:b w:val="0"/>
+          <w:i w:val="0"/>
+          <w:sz w:val="22"/>
+        </w:rPr>
+        <w:t>• Rust 标准库文档：实现零外部依赖的技术基础</w:t>
+      </w:r>
+    </w:p>
+    <w:p>
+      <w:r>
+        <w:rPr>
+          <w:rFonts w:ascii="Microsoft YaHei" w:hAnsi="Microsoft YaHei"/>
+          <w:b w:val="0"/>
+          <w:i w:val="0"/>
+          <w:sz w:val="22"/>
+        </w:rPr>
+        <w:t>• JetStream 基准测试：未来性能测试方向的参考</w:t>
+      </w:r>
+    </w:p>
+    <w:p>
+      <w:pPr>
+        <w:pStyle w:val="Heading1"/>
+      </w:pPr>
+      <w:r>
+        <w:rPr>
+          <w:rFonts w:ascii="Microsoft YaHei" w:hAnsi="Microsoft YaHei"/>
+        </w:rPr>
+        <w:t>三、系统框架设计</w:t>
+      </w:r>
+    </w:p>
+    <w:p>
+      <w:pPr>
+        <w:pStyle w:val="Heading2"/>
+      </w:pPr>
+      <w:r>
+        <w:rPr>
+          <w:rFonts w:ascii="Microsoft YaHei" w:hAnsi="Microsoft YaHei"/>
+        </w:rPr>
+        <w:t>3.1 总体架构</w:t>
+      </w:r>
+    </w:p>
+    <w:p>
+      <w:r>
+        <w:rPr>
+          <w:rFonts w:ascii="Microsoft YaHei" w:hAnsi="Microsoft YaHei"/>
+          <w:b w:val="0"/>
+          <w:i/>
           <w:sz w:val="22"/>
         </w:rPr>
         <w:t>执行流水线：</w:t>
@@ -144,7 +603,7 @@
           <w:i w:val="0"/>
           <w:sz w:val="22"/>
         </w:rPr>
-        <w:t>采用经典的编译前端四阶段设计，但不生成字节码或机器码，而是直接由树遍历解释器执行 AST。</w:t>
+        <w:t>采用经典编译前端四阶段设计，不生成字节码或机器码，直接由树遍历解释器执行 AST。</w:t>
       </w:r>
     </w:p>
     <w:p>
@@ -155,7 +614,7 @@
         <w:rPr>
           <w:rFonts w:ascii="Microsoft YaHei" w:hAnsi="Microsoft YaHei"/>
         </w:rPr>
-        <w:t>2.3 模块划分</w:t>
+        <w:t>3.2 模块划分</w:t>
       </w:r>
     </w:p>
     <w:tbl>
@@ -256,7 +715,7 @@
                 <w:rFonts w:ascii="Microsoft YaHei" w:hAnsi="Microsoft YaHei"/>
                 <w:sz w:val="20"/>
               </w:rPr>
-              <w:t>手写字符级词法分析，生成 Token 序列</w:t>
+              <w:t>字符级词法分析，生成 Token 序列</w:t>
             </w:r>
           </w:p>
         </w:tc>
@@ -613,6 +1072,50 @@
           </w:p>
         </w:tc>
       </w:tr>
+      <w:tr>
+        <w:tc>
+          <w:tcPr>
+            <w:tcW w:type="dxa" w:w="3135"/>
+          </w:tcPr>
+          <w:p>
+            <w:r>
+              <w:rPr>
+                <w:rFonts w:ascii="Microsoft YaHei" w:hAnsi="Microsoft YaHei"/>
+                <w:sz w:val="20"/>
+              </w:rPr>
+              <w:t>库入口</w:t>
+            </w:r>
+          </w:p>
+        </w:tc>
+        <w:tc>
+          <w:tcPr>
+            <w:tcW w:type="dxa" w:w="3135"/>
+          </w:tcPr>
+          <w:p>
+            <w:r>
+              <w:rPr>
+                <w:rFonts w:ascii="Microsoft YaHei" w:hAnsi="Microsoft YaHei"/>
+                <w:sz w:val="20"/>
+              </w:rPr>
+              <w:t>src/lib.rs</w:t>
+            </w:r>
+          </w:p>
+        </w:tc>
+        <w:tc>
+          <w:tcPr>
+            <w:tcW w:type="dxa" w:w="3135"/>
+          </w:tcPr>
+          <w:p>
+            <w:r>
+              <w:rPr>
+                <w:rFonts w:ascii="Microsoft YaHei" w:hAnsi="Microsoft YaHei"/>
+                <w:sz w:val="20"/>
+              </w:rPr>
+              <w:t>公开 API 和便利函数</w:t>
+            </w:r>
+          </w:p>
+        </w:tc>
+      </w:tr>
     </w:tbl>
     <w:p>
       <w:pPr>
@@ -622,7 +1125,7 @@
         <w:rPr>
           <w:rFonts w:ascii="Microsoft YaHei" w:hAnsi="Microsoft YaHei"/>
         </w:rPr>
-        <w:t>2.4 关键设计决策</w:t>
+        <w:t>3.3 关键设计决策</w:t>
       </w:r>
     </w:p>
     <w:p>
@@ -633,7 +1136,7 @@
           <w:i w:val="0"/>
           <w:sz w:val="22"/>
         </w:rPr>
-        <w:t>1. 零外部依赖：不使用任何第三方 Rust crate，完全依靠 Rust 标准库实现。</w:t>
+        <w:t>1. 零外部依赖：不使用任何第三方 Rust crate</w:t>
       </w:r>
     </w:p>
     <w:p>
@@ -644,7 +1147,7 @@
           <w:i w:val="0"/>
           <w:sz w:val="22"/>
         </w:rPr>
-        <w:t>2. 手写实现而非套壳：自研 lexer、parser、AST、解释器，不包装 QuickJS、Boa、V8、Node.js 或 Deno。</w:t>
+        <w:t>2. 手写实现而非套壳：自研 lexer/parser/AST/解释器</w:t>
       </w:r>
     </w:p>
     <w:p>
@@ -655,7 +1158,7 @@
           <w:i w:val="0"/>
           <w:sz w:val="22"/>
         </w:rPr>
-        <w:t>3. 树遍历解释器而非字节码 VM：MVP 阶段优先保证正确性和可扩展性，后续可引入字节码编译层。</w:t>
+        <w:t>3. 树遍历解释器：MVP 阶段优先保证正确性和可扩展性</w:t>
       </w:r>
     </w:p>
     <w:p>
@@ -666,7 +1169,7 @@
           <w:i w:val="0"/>
           <w:sz w:val="22"/>
         </w:rPr>
-        <w:t>4. Agent 优先的接口设计：--agent-eval 模式输出结构化 JSON，包含 ok、value、value_type、output、error_kind、error 等字段。</w:t>
+        <w:t>4. Agent 优先接口：--agent-eval 模式输出结构化 JSON</w:t>
       </w:r>
     </w:p>
     <w:p>
@@ -677,7 +1180,40 @@
           <w:i w:val="0"/>
           <w:sz w:val="22"/>
         </w:rPr>
-        <w:t>5. 资源限制机制：内置源码大小限制（64KB）、执行步数限制（100K）、调用深度限制（16层）、输出行数限制（256行），防止恶意或失控脚本。</w:t>
+        <w:t>5. 资源限制机制：源码 64KB / 步数 100K / 深度 16 层 / 输出 256 行</w:t>
+      </w:r>
+    </w:p>
+    <w:p>
+      <w:pPr>
+        <w:pStyle w:val="Heading2"/>
+      </w:pPr>
+      <w:r>
+        <w:rPr>
+          <w:rFonts w:ascii="Microsoft YaHei" w:hAnsi="Microsoft YaHei"/>
+        </w:rPr>
+        <w:t>3.4 运行时值模型</w:t>
+      </w:r>
+    </w:p>
+    <w:p>
+      <w:r>
+        <w:rPr>
+          <w:rFonts w:ascii="Microsoft YaHei" w:hAnsi="Microsoft YaHei"/>
+          <w:b w:val="0"/>
+          <w:i w:val="0"/>
+          <w:sz w:val="22"/>
+        </w:rPr>
+        <w:t>Value = Number(f64) | String(String) | Bool(bool) | Null | Undefined | Object(ObjectRef)</w:t>
+      </w:r>
+    </w:p>
+    <w:p>
+      <w:r>
+        <w:rPr>
+          <w:rFonts w:ascii="Microsoft YaHei" w:hAnsi="Microsoft YaHei"/>
+          <w:b w:val="0"/>
+          <w:i w:val="0"/>
+          <w:sz w:val="22"/>
+        </w:rPr>
+        <w:t>采用 Rc&lt;RefCell&lt;Object&gt;&gt; 实现共享可变引用，解决 Rust 所有权与 JS 引用语义的冲突。</w:t>
       </w:r>
     </w:p>
     <w:p>
@@ -688,7 +1224,7 @@
         <w:rPr>
           <w:rFonts w:ascii="Microsoft YaHei" w:hAnsi="Microsoft YaHei"/>
         </w:rPr>
-        <w:t>三、实现重点</w:t>
+        <w:t>四、开发计划</w:t>
       </w:r>
     </w:p>
     <w:p>
@@ -699,7 +1235,7 @@
         <w:rPr>
           <w:rFonts w:ascii="Microsoft YaHei" w:hAnsi="Microsoft YaHei"/>
         </w:rPr>
-        <w:t>3.1 词法分析器（src/lexer.rs）</w:t>
+        <w:t>4.1 总体计划</w:t>
       </w:r>
     </w:p>
     <w:p>
@@ -710,7 +1246,7 @@
           <w:i w:val="0"/>
           <w:sz w:val="22"/>
         </w:rPr>
-        <w:t>字符级扫描，支持 Unicode 字符。处理单行注释 // 和多行注释 /* */。支持数字字面量（整数和小数）、字符串字面量（单引号和双引号，含转义序列）。标识符和关键字识别通过 keyword_or_identifier 函数实现。运算符消歧义：+/++/+=、-/--/-=、=/==/=== 等。错误位置记录行号、列号、字节偏移。</w:t>
+        <w:t>项目开发周期为 2026 年 6 月 5 日至 6 月 30 日，分为 5 个阶段。</w:t>
       </w:r>
     </w:p>
     <w:p>
@@ -721,7 +1257,384 @@
         <w:rPr>
           <w:rFonts w:ascii="Microsoft YaHei" w:hAnsi="Microsoft YaHei"/>
         </w:rPr>
-        <w:t>3.2 语法分析器（src/parser.rs）</w:t>
+        <w:t>4.2 阶段计划与完成情况</w:t>
+      </w:r>
+    </w:p>
+    <w:tbl>
+      <w:tblPr>
+        <w:tblStyle w:val="LightGrid-Accent1"/>
+        <w:tblW w:type="auto" w:w="0"/>
+        <w:jc w:val="center"/>
+        <w:tblLook w:firstColumn="1" w:firstRow="1" w:lastColumn="0" w:lastRow="0" w:noHBand="0" w:noVBand="1" w:val="04A0"/>
+      </w:tblPr>
+      <w:tblGrid>
+        <w:gridCol w:w="2351"/>
+        <w:gridCol w:w="2351"/>
+        <w:gridCol w:w="2351"/>
+        <w:gridCol w:w="2351"/>
+      </w:tblGrid>
+      <w:tr>
+        <w:tc>
+          <w:tcPr>
+            <w:tcW w:type="dxa" w:w="2351"/>
+          </w:tcPr>
+          <w:p>
+            <w:r>
+              <w:rPr>
+                <w:rFonts w:ascii="Microsoft YaHei" w:hAnsi="Microsoft YaHei"/>
+                <w:b/>
+                <w:sz w:val="20"/>
+              </w:rPr>
+              <w:t>阶段</w:t>
+            </w:r>
+          </w:p>
+        </w:tc>
+        <w:tc>
+          <w:tcPr>
+            <w:tcW w:type="dxa" w:w="2351"/>
+          </w:tcPr>
+          <w:p>
+            <w:r>
+              <w:rPr>
+                <w:rFonts w:ascii="Microsoft YaHei" w:hAnsi="Microsoft YaHei"/>
+                <w:b/>
+                <w:sz w:val="20"/>
+              </w:rPr>
+              <w:t>时间</w:t>
+            </w:r>
+          </w:p>
+        </w:tc>
+        <w:tc>
+          <w:tcPr>
+            <w:tcW w:type="dxa" w:w="2351"/>
+          </w:tcPr>
+          <w:p>
+            <w:r>
+              <w:rPr>
+                <w:rFonts w:ascii="Microsoft YaHei" w:hAnsi="Microsoft YaHei"/>
+                <w:b/>
+                <w:sz w:val="20"/>
+              </w:rPr>
+              <w:t>计划任务</w:t>
+            </w:r>
+          </w:p>
+        </w:tc>
+        <w:tc>
+          <w:tcPr>
+            <w:tcW w:type="dxa" w:w="2351"/>
+          </w:tcPr>
+          <w:p>
+            <w:r>
+              <w:rPr>
+                <w:rFonts w:ascii="Microsoft YaHei" w:hAnsi="Microsoft YaHei"/>
+                <w:b/>
+                <w:sz w:val="20"/>
+              </w:rPr>
+              <w:t>完成情况</w:t>
+            </w:r>
+          </w:p>
+        </w:tc>
+      </w:tr>
+      <w:tr>
+        <w:tc>
+          <w:tcPr>
+            <w:tcW w:type="dxa" w:w="2351"/>
+          </w:tcPr>
+          <w:p>
+            <w:r>
+              <w:rPr>
+                <w:rFonts w:ascii="Microsoft YaHei" w:hAnsi="Microsoft YaHei"/>
+                <w:sz w:val="20"/>
+              </w:rPr>
+              <w:t>第一阶段：基础框架搭建</w:t>
+            </w:r>
+          </w:p>
+        </w:tc>
+        <w:tc>
+          <w:tcPr>
+            <w:tcW w:type="dxa" w:w="2351"/>
+          </w:tcPr>
+          <w:p>
+            <w:r>
+              <w:rPr>
+                <w:rFonts w:ascii="Microsoft YaHei" w:hAnsi="Microsoft YaHei"/>
+                <w:sz w:val="20"/>
+              </w:rPr>
+              <w:t>6/5 – 6/9</w:t>
+            </w:r>
+          </w:p>
+        </w:tc>
+        <w:tc>
+          <w:tcPr>
+            <w:tcW w:type="dxa" w:w="2351"/>
+          </w:tcPr>
+          <w:p>
+            <w:r>
+              <w:rPr>
+                <w:rFonts w:ascii="Microsoft YaHei" w:hAnsi="Microsoft YaHei"/>
+                <w:sz w:val="20"/>
+              </w:rPr>
+              <w:t>Rust 脚手架、lexer、parser、AST、test262</w:t>
+            </w:r>
+          </w:p>
+        </w:tc>
+        <w:tc>
+          <w:tcPr>
+            <w:tcW w:type="dxa" w:w="2351"/>
+          </w:tcPr>
+          <w:p>
+            <w:r>
+              <w:rPr>
+                <w:rFonts w:ascii="Microsoft YaHei" w:hAnsi="Microsoft YaHei"/>
+                <w:sz w:val="20"/>
+              </w:rPr>
+              <w:t>全部完成</w:t>
+            </w:r>
+          </w:p>
+        </w:tc>
+      </w:tr>
+      <w:tr>
+        <w:tc>
+          <w:tcPr>
+            <w:tcW w:type="dxa" w:w="2351"/>
+          </w:tcPr>
+          <w:p>
+            <w:r>
+              <w:rPr>
+                <w:rFonts w:ascii="Microsoft YaHei" w:hAnsi="Microsoft YaHei"/>
+                <w:sz w:val="20"/>
+              </w:rPr>
+              <w:t>第二阶段：核心引擎开发</w:t>
+            </w:r>
+          </w:p>
+        </w:tc>
+        <w:tc>
+          <w:tcPr>
+            <w:tcW w:type="dxa" w:w="2351"/>
+          </w:tcPr>
+          <w:p>
+            <w:r>
+              <w:rPr>
+                <w:rFonts w:ascii="Microsoft YaHei" w:hAnsi="Microsoft YaHei"/>
+                <w:sz w:val="20"/>
+              </w:rPr>
+              <w:t>6/10 – 6/13</w:t>
+            </w:r>
+          </w:p>
+        </w:tc>
+        <w:tc>
+          <w:tcPr>
+            <w:tcW w:type="dxa" w:w="2351"/>
+          </w:tcPr>
+          <w:p>
+            <w:r>
+              <w:rPr>
+                <w:rFonts w:ascii="Microsoft YaHei" w:hAnsi="Microsoft YaHei"/>
+                <w:sz w:val="20"/>
+              </w:rPr>
+              <w:t>解释器、闭包、原型链、控制流</w:t>
+            </w:r>
+          </w:p>
+        </w:tc>
+        <w:tc>
+          <w:tcPr>
+            <w:tcW w:type="dxa" w:w="2351"/>
+          </w:tcPr>
+          <w:p>
+            <w:r>
+              <w:rPr>
+                <w:rFonts w:ascii="Microsoft YaHei" w:hAnsi="Microsoft YaHei"/>
+                <w:sz w:val="20"/>
+              </w:rPr>
+              <w:t>全部完成</w:t>
+            </w:r>
+          </w:p>
+        </w:tc>
+      </w:tr>
+      <w:tr>
+        <w:tc>
+          <w:tcPr>
+            <w:tcW w:type="dxa" w:w="2351"/>
+          </w:tcPr>
+          <w:p>
+            <w:r>
+              <w:rPr>
+                <w:rFonts w:ascii="Microsoft YaHei" w:hAnsi="Microsoft YaHei"/>
+                <w:sz w:val="20"/>
+              </w:rPr>
+              <w:t>第三阶段：Agent 接口 &amp; REPL</w:t>
+            </w:r>
+          </w:p>
+        </w:tc>
+        <w:tc>
+          <w:tcPr>
+            <w:tcW w:type="dxa" w:w="2351"/>
+          </w:tcPr>
+          <w:p>
+            <w:r>
+              <w:rPr>
+                <w:rFonts w:ascii="Microsoft YaHei" w:hAnsi="Microsoft YaHei"/>
+                <w:sz w:val="20"/>
+              </w:rPr>
+              <w:t>6/15 – 6/17</w:t>
+            </w:r>
+          </w:p>
+        </w:tc>
+        <w:tc>
+          <w:tcPr>
+            <w:tcW w:type="dxa" w:w="2351"/>
+          </w:tcPr>
+          <w:p>
+            <w:r>
+              <w:rPr>
+                <w:rFonts w:ascii="Microsoft YaHei" w:hAnsi="Microsoft YaHei"/>
+                <w:sz w:val="20"/>
+              </w:rPr>
+              <w:t>REPL、--agent-eval、资源限制</w:t>
+            </w:r>
+          </w:p>
+        </w:tc>
+        <w:tc>
+          <w:tcPr>
+            <w:tcW w:type="dxa" w:w="2351"/>
+          </w:tcPr>
+          <w:p>
+            <w:r>
+              <w:rPr>
+                <w:rFonts w:ascii="Microsoft YaHei" w:hAnsi="Microsoft YaHei"/>
+                <w:sz w:val="20"/>
+              </w:rPr>
+              <w:t>全部完成</w:t>
+            </w:r>
+          </w:p>
+        </w:tc>
+      </w:tr>
+      <w:tr>
+        <w:tc>
+          <w:tcPr>
+            <w:tcW w:type="dxa" w:w="2351"/>
+          </w:tcPr>
+          <w:p>
+            <w:r>
+              <w:rPr>
+                <w:rFonts w:ascii="Microsoft YaHei" w:hAnsi="Microsoft YaHei"/>
+                <w:sz w:val="20"/>
+              </w:rPr>
+              <w:t>第四阶段：标准库扩展</w:t>
+            </w:r>
+          </w:p>
+        </w:tc>
+        <w:tc>
+          <w:tcPr>
+            <w:tcW w:type="dxa" w:w="2351"/>
+          </w:tcPr>
+          <w:p>
+            <w:r>
+              <w:rPr>
+                <w:rFonts w:ascii="Microsoft YaHei" w:hAnsi="Microsoft YaHei"/>
+                <w:sz w:val="20"/>
+              </w:rPr>
+              <w:t>6/23 – 6/30</w:t>
+            </w:r>
+          </w:p>
+        </w:tc>
+        <w:tc>
+          <w:tcPr>
+            <w:tcW w:type="dxa" w:w="2351"/>
+          </w:tcPr>
+          <w:p>
+            <w:r>
+              <w:rPr>
+                <w:rFonts w:ascii="Microsoft YaHei" w:hAnsi="Microsoft YaHei"/>
+                <w:sz w:val="20"/>
+              </w:rPr>
+              <w:t>Object/Array/String 等 80+ 函数</w:t>
+            </w:r>
+          </w:p>
+        </w:tc>
+        <w:tc>
+          <w:tcPr>
+            <w:tcW w:type="dxa" w:w="2351"/>
+          </w:tcPr>
+          <w:p>
+            <w:r>
+              <w:rPr>
+                <w:rFonts w:ascii="Microsoft YaHei" w:hAnsi="Microsoft YaHei"/>
+                <w:sz w:val="20"/>
+              </w:rPr>
+              <w:t>全部完成</w:t>
+            </w:r>
+          </w:p>
+        </w:tc>
+      </w:tr>
+      <w:tr>
+        <w:tc>
+          <w:tcPr>
+            <w:tcW w:type="dxa" w:w="2351"/>
+          </w:tcPr>
+          <w:p>
+            <w:r>
+              <w:rPr>
+                <w:rFonts w:ascii="Microsoft YaHei" w:hAnsi="Microsoft YaHei"/>
+                <w:sz w:val="20"/>
+              </w:rPr>
+              <w:t>第五阶段：高级语法补充</w:t>
+            </w:r>
+          </w:p>
+        </w:tc>
+        <w:tc>
+          <w:tcPr>
+            <w:tcW w:type="dxa" w:w="2351"/>
+          </w:tcPr>
+          <w:p>
+            <w:r>
+              <w:rPr>
+                <w:rFonts w:ascii="Microsoft YaHei" w:hAnsi="Microsoft YaHei"/>
+                <w:sz w:val="20"/>
+              </w:rPr>
+              <w:t>6/30</w:t>
+            </w:r>
+          </w:p>
+        </w:tc>
+        <w:tc>
+          <w:tcPr>
+            <w:tcW w:type="dxa" w:w="2351"/>
+          </w:tcPr>
+          <w:p>
+            <w:r>
+              <w:rPr>
+                <w:rFonts w:ascii="Microsoft YaHei" w:hAnsi="Microsoft YaHei"/>
+                <w:sz w:val="20"/>
+              </w:rPr>
+              <w:t>模板字面量、箭头函数、位运算</w:t>
+            </w:r>
+          </w:p>
+        </w:tc>
+        <w:tc>
+          <w:tcPr>
+            <w:tcW w:type="dxa" w:w="2351"/>
+          </w:tcPr>
+          <w:p>
+            <w:r>
+              <w:rPr>
+                <w:rFonts w:ascii="Microsoft YaHei" w:hAnsi="Microsoft YaHei"/>
+                <w:sz w:val="20"/>
+              </w:rPr>
+              <w:t>全部完成</w:t>
+            </w:r>
+          </w:p>
+        </w:tc>
+      </w:tr>
+    </w:tbl>
+    <w:p>
+      <w:pPr>
+        <w:pStyle w:val="Heading2"/>
+      </w:pPr>
+      <w:r>
+        <w:rPr>
+          <w:rFonts w:ascii="Microsoft YaHei" w:hAnsi="Microsoft YaHei"/>
+        </w:rPr>
+        <w:t>4.3 任务分解</w:t>
       </w:r>
     </w:p>
     <w:p>
@@ -732,7 +1645,18 @@
           <w:i w:val="0"/>
           <w:sz w:val="22"/>
         </w:rPr>
-        <w:t>递归下降解析，支持运算符优先级层次：assignment -&gt; conditional -&gt; logical_or -&gt; logical_and -&gt; equality -&gt; comparison -&gt; term -&gt; factor -&gt; unary -&gt; call -&gt; primary。</w:t>
+        <w:t>合计 87+ 次提交，覆盖词法分析器、语法分析器、解释器、标准库、Agent 模式、高级语法等全部功能。</w:t>
+      </w:r>
+    </w:p>
+    <w:p>
+      <w:pPr>
+        <w:pStyle w:val="Heading1"/>
+      </w:pPr>
+      <w:r>
+        <w:rPr>
+          <w:rFonts w:ascii="Microsoft YaHei" w:hAnsi="Microsoft YaHei"/>
+        </w:rPr>
+        <w:t>五、比赛过程中的重要进展</w:t>
       </w:r>
     </w:p>
     <w:p>
@@ -743,7 +1667,7 @@
           <w:i w:val="0"/>
           <w:sz w:val="22"/>
         </w:rPr>
-        <w:t>语句类型：VarDecl、FunctionDecl、Return、Throw、Try、If、While、For、Switch、Block、Break、Continue、Expr。</w:t>
+        <w:t>5.1 初始阶段（6/5）：初始化 Rust 项目脚手架，完成中英文 README，实现基础 Agent 工具接口原型。</w:t>
       </w:r>
     </w:p>
     <w:p>
@@ -754,7 +1678,7 @@
           <w:i w:val="0"/>
           <w:sz w:val="22"/>
         </w:rPr>
-        <w:t>表达式类型：Number、String、Bool、Null、Undefined、This、Identifier、Array、Object、Function、Unary、Typeof、Conditional、Binary、Assign、CompoundAssign、Update、Call、New、Member、Index。</w:t>
+        <w:t>5.2 语法引擎突破（6/7 – 6/9）：完成 typeof 运算符、未初始化 let、break/continue、三元表达式、复合赋值、自增自减、REPL 交互式解释器、test262 框架、多变量声明、函数表达式、成员访问/赋值、对象/数组基础模型、throw、循环、instanceof、typeof。</w:t>
       </w:r>
     </w:p>
     <w:p>
@@ -765,7 +1689,51 @@
           <w:i w:val="0"/>
           <w:sz w:val="22"/>
         </w:rPr>
-        <w:t>左值检查（is_assignable）：只有标识符、成员访问、下标访问可作为赋值目标。自动分号插入（ASI）的简化处理。</w:t>
+        <w:t>5.3 引擎重写完成（6/12）：完成解释器重写，支持闭包、原型链、this 绑定，实现完整的词法作用域链式环境。</w:t>
+      </w:r>
+    </w:p>
+    <w:p>
+      <w:r>
+        <w:rPr>
+          <w:rFonts w:ascii="Microsoft YaHei" w:hAnsi="Microsoft YaHei"/>
+          <w:b w:val="0"/>
+          <w:i w:val="0"/>
+          <w:sz w:val="22"/>
+        </w:rPr>
+        <w:t>5.4 测试与完善（6/13 – 6/17）：完善测试机功能，增加 Agent 执行步数限制、调用深度限制、输出限制，REPL 功能更新。</w:t>
+      </w:r>
+    </w:p>
+    <w:p>
+      <w:r>
+        <w:rPr>
+          <w:rFonts w:ascii="Microsoft YaHei" w:hAnsi="Microsoft YaHei"/>
+          <w:b w:val="0"/>
+          <w:i w:val="0"/>
+          <w:sz w:val="22"/>
+        </w:rPr>
+        <w:t>5.5 标准库大规模扩展（6/23 – 6/30）：Object 系列（keys/values/create/defineProperty 等）、Array 系列（map/filter/forEach/sort/reduce 等 27 方法）、String 系列（split/replace/trim 等 18 方法）、Function.prototype（call/apply/bind）、Math 对象、JSON.stringify、Error 系列。</w:t>
+      </w:r>
+    </w:p>
+    <w:p>
+      <w:r>
+        <w:rPr>
+          <w:rFonts w:ascii="Microsoft YaHei" w:hAnsi="Microsoft YaHei"/>
+          <w:b w:val="0"/>
+          <w:i w:val="0"/>
+          <w:sz w:val="22"/>
+        </w:rPr>
+        <w:t>5.6 高级语法补充（6/30）：模板字面量、箭头函数、位运算符、for...in 循环、delete/void/in 运算符。</w:t>
+      </w:r>
+    </w:p>
+    <w:p>
+      <w:pPr>
+        <w:pStyle w:val="Heading1"/>
+      </w:pPr>
+      <w:r>
+        <w:rPr>
+          <w:rFonts w:ascii="Microsoft YaHei" w:hAnsi="Microsoft YaHei"/>
+        </w:rPr>
+        <w:t>六、系统测试情况</w:t>
       </w:r>
     </w:p>
     <w:p>
@@ -776,7 +1744,7 @@
         <w:rPr>
           <w:rFonts w:ascii="Microsoft YaHei" w:hAnsi="Microsoft YaHei"/>
         </w:rPr>
-        <w:t>3.3 运行时值模型（src/value.rs）</w:t>
+        <w:t>6.1 单元测试</w:t>
       </w:r>
     </w:p>
     <w:p>
@@ -787,673 +1755,7 @@
           <w:i w:val="0"/>
           <w:sz w:val="22"/>
         </w:rPr>
-        <w:t>基础类型：Number(f64)、String(String)、Bool(bool)、Null、Undefined、Object(ObjectRef)。</w:t>
-      </w:r>
-    </w:p>
-    <w:p>
-      <w:r>
-        <w:rPr>
-          <w:rFonts w:ascii="Microsoft YaHei" w:hAnsi="Microsoft YaHei"/>
-          <w:b w:val="0"/>
-          <w:i w:val="0"/>
-          <w:sz w:val="22"/>
-        </w:rPr>
-        <w:t>对象模型：Rc&lt;RefCell&lt;Object&gt;&gt; 实现共享可变引用。对象内部类型（Internal）：Plain、Array、Function、Native、Bound。</w:t>
-      </w:r>
-    </w:p>
-    <w:p>
-      <w:r>
-        <w:rPr>
-          <w:rFonts w:ascii="Microsoft YaHei" w:hAnsi="Microsoft YaHei"/>
-          <w:b w:val="0"/>
-          <w:i w:val="0"/>
-          <w:sz w:val="22"/>
-        </w:rPr>
-        <w:t>原型链支持：Object.proto 字段，Object::lookup 递归查找。抽象相等比较（abstract_eq）实现 ECMAScript 抽象相等算法。</w:t>
-      </w:r>
-    </w:p>
-    <w:p>
-      <w:pPr>
-        <w:pStyle w:val="Heading2"/>
-      </w:pPr>
-      <w:r>
-        <w:rPr>
-          <w:rFonts w:ascii="Microsoft YaHei" w:hAnsi="Microsoft YaHei"/>
-        </w:rPr>
-        <w:t>3.4 解释器（src/interpreter.rs）</w:t>
-      </w:r>
-    </w:p>
-    <w:p>
-      <w:r>
-        <w:rPr>
-          <w:rFonts w:ascii="Microsoft YaHei" w:hAnsi="Microsoft YaHei"/>
-          <w:b w:val="0"/>
-          <w:i w:val="0"/>
-          <w:sz w:val="22"/>
-        </w:rPr>
-        <w:t>词法环境：Env 结构体实现链式作用域，闭包通过 closures HashMap 保存。</w:t>
-      </w:r>
-    </w:p>
-    <w:p>
-      <w:r>
-        <w:rPr>
-          <w:rFonts w:ascii="Microsoft YaHei" w:hAnsi="Microsoft YaHei"/>
-          <w:b w:val="0"/>
-          <w:i w:val="0"/>
-          <w:sz w:val="22"/>
-        </w:rPr>
-        <w:t>控制流：Flow 枚举（Value、Return、Throw、Break、Continue）统一处理语句执行结果。</w:t>
-      </w:r>
-    </w:p>
-    <w:p>
-      <w:r>
-        <w:rPr>
-          <w:rFonts w:ascii="Microsoft YaHei" w:hAnsi="Microsoft YaHei"/>
-          <w:b w:val="0"/>
-          <w:i w:val="0"/>
-          <w:sz w:val="22"/>
-        </w:rPr>
-        <w:t>函数调用：call 方法处理普通调用和 new 构造调用。内置函数注册：install_builtins 注册所有标准库函数。</w:t>
-      </w:r>
-    </w:p>
-    <w:p>
-      <w:r>
-        <w:rPr>
-          <w:rFonts w:ascii="Microsoft YaHei" w:hAnsi="Microsoft YaHei"/>
-          <w:b w:val="0"/>
-          <w:i w:val="0"/>
-          <w:sz w:val="22"/>
-        </w:rPr>
-        <w:t>资源限制：step 方法计数执行步数，enter_call/leave_call 跟踪调用深度，push_output 限制输出行数。</w:t>
-      </w:r>
-    </w:p>
-    <w:p>
-      <w:pPr>
-        <w:pStyle w:val="Heading2"/>
-      </w:pPr>
-      <w:r>
-        <w:rPr>
-          <w:rFonts w:ascii="Microsoft YaHei" w:hAnsi="Microsoft YaHei"/>
-        </w:rPr>
-        <w:t>3.5 Agent 接口（src/agent.rs）</w:t>
-      </w:r>
-    </w:p>
-    <w:p>
-      <w:r>
-        <w:rPr>
-          <w:rFonts w:ascii="Microsoft YaHei" w:hAnsi="Microsoft YaHei"/>
-          <w:b w:val="0"/>
-          <w:i w:val="0"/>
-          <w:sz w:val="22"/>
-        </w:rPr>
-        <w:t>AgentRuntime 封装执行上下文，提供 run 方法。RuntimeLimits 统一资源限制配置。AgentToolResult 提供结构化結果和 JSON 序列化。AgentErrorKind 提供稳定错误分类（lex、parse、runtime、source_limit、step_limit、call_depth_limit）。</w:t>
-      </w:r>
-    </w:p>
-    <w:p>
-      <w:pPr>
-        <w:pStyle w:val="Heading2"/>
-      </w:pPr>
-      <w:r>
-        <w:rPr>
-          <w:rFonts w:ascii="Microsoft YaHei" w:hAnsi="Microsoft YaHei"/>
-        </w:rPr>
-        <w:t>3.6 标准库实现</w:t>
-      </w:r>
-    </w:p>
-    <w:p>
-      <w:r>
-        <w:rPr>
-          <w:rFonts w:ascii="Microsoft YaHei" w:hAnsi="Microsoft YaHei"/>
-          <w:b w:val="0"/>
-          <w:i w:val="0"/>
-          <w:sz w:val="22"/>
-        </w:rPr>
-        <w:t>已实现的 built-in 包括 Object 系列（Object.create、Object.defineProperty、Object.keys、Object.values 等）、Array 系列（map、filter、forEach、push、pop、shift、sort、reduce 等）、String 系列（slice、trim、replace、split 等）、以及其他（Number、Boolean、Error 系列构造函数、Function.prototype.call/apply/bind 等）。</w:t>
-      </w:r>
-    </w:p>
-    <w:p>
-      <w:pPr>
-        <w:pStyle w:val="Heading1"/>
-      </w:pPr>
-      <w:r>
-        <w:rPr>
-          <w:rFonts w:ascii="Microsoft YaHei" w:hAnsi="Microsoft YaHei"/>
-        </w:rPr>
-        <w:t>四、开发过程中遇到的问题和解决方法</w:t>
-      </w:r>
-    </w:p>
-    <w:p>
-      <w:pPr>
-        <w:pStyle w:val="Heading2"/>
-      </w:pPr>
-      <w:r>
-        <w:rPr>
-          <w:rFonts w:ascii="Microsoft YaHei" w:hAnsi="Microsoft YaHei"/>
-        </w:rPr>
-        <w:t>4.1 Rust 所有权与 JS 引用语义的冲突</w:t>
-      </w:r>
-    </w:p>
-    <w:p>
-      <w:r>
-        <w:rPr>
-          <w:rFonts w:ascii="Microsoft YaHei" w:hAnsi="Microsoft YaHei"/>
-          <w:b w:val="0"/>
-          <w:i w:val="0"/>
-          <w:sz w:val="22"/>
-        </w:rPr>
-        <w:t>问题：JavaScript 对象是引用类型，多个变量可以引用同一个对象。Rust 的所有权模型不允许共享可变引用。</w:t>
-      </w:r>
-    </w:p>
-    <w:p>
-      <w:r>
-        <w:rPr>
-          <w:rFonts w:ascii="Microsoft YaHei" w:hAnsi="Microsoft YaHei"/>
-          <w:b w:val="0"/>
-          <w:i w:val="0"/>
-          <w:sz w:val="22"/>
-        </w:rPr>
-        <w:t>解决方法：采用 Rc&lt;RefCell&lt;Object&gt;&gt;（ObjectRef）模式。Rc 允许共享所有权，RefCell 提供运行时借用检查。</w:t>
-      </w:r>
-    </w:p>
-    <w:p>
-      <w:pPr>
-        <w:pStyle w:val="Heading2"/>
-      </w:pPr>
-      <w:r>
-        <w:rPr>
-          <w:rFonts w:ascii="Microsoft YaHei" w:hAnsi="Microsoft YaHei"/>
-        </w:rPr>
-        <w:t>4.2 闭包环境捕获</w:t>
-      </w:r>
-    </w:p>
-    <w:p>
-      <w:r>
-        <w:rPr>
-          <w:rFonts w:ascii="Microsoft YaHei" w:hAnsi="Microsoft YaHei"/>
-          <w:b w:val="0"/>
-          <w:i w:val="0"/>
-          <w:sz w:val="22"/>
-        </w:rPr>
-        <w:t>问题：JS 闭包需要捕获定义时的词法环境，但环境可能在后续执行中变化。</w:t>
-      </w:r>
-    </w:p>
-    <w:p>
-      <w:r>
-        <w:rPr>
-          <w:rFonts w:ascii="Microsoft YaHei" w:hAnsi="Microsoft YaHei"/>
-          <w:b w:val="0"/>
-          <w:i w:val="0"/>
-          <w:sz w:val="22"/>
-        </w:rPr>
-        <w:t>解决方法：在 make_function 时调用 remember_closure，将当前环境的 Rc 指针存入 closures HashMap，以函数对象的指针地址作为键。</w:t>
-      </w:r>
-    </w:p>
-    <w:p>
-      <w:pPr>
-        <w:pStyle w:val="Heading2"/>
-      </w:pPr>
-      <w:r>
-        <w:rPr>
-          <w:rFonts w:ascii="Microsoft YaHei" w:hAnsi="Microsoft YaHei"/>
-        </w:rPr>
-        <w:t>4.3 数组空洞（hole）与 undefined 的区分</w:t>
-      </w:r>
-    </w:p>
-    <w:p>
-      <w:r>
-        <w:rPr>
-          <w:rFonts w:ascii="Microsoft YaHei" w:hAnsi="Microsoft YaHei"/>
-          <w:b w:val="0"/>
-          <w:i w:val="0"/>
-          <w:sz w:val="22"/>
-        </w:rPr>
-        <w:t>问题：JS 中数组空洞返回 undefined 但 hasOwnProperty 返回 false。</w:t>
-      </w:r>
-    </w:p>
-    <w:p>
-      <w:r>
-        <w:rPr>
-          <w:rFonts w:ascii="Microsoft YaHei" w:hAnsi="Microsoft YaHei"/>
-          <w:b w:val="0"/>
-          <w:i w:val="0"/>
-          <w:sz w:val="22"/>
-        </w:rPr>
-        <w:t>解决方法：数组内部使用 Vec&lt;Option&lt;Value&gt;&gt;，None 表示空洞，Some(Value::Undefined) 表示显式赋值。</w:t>
-      </w:r>
-    </w:p>
-    <w:p>
-      <w:pPr>
-        <w:pStyle w:val="Heading2"/>
-      </w:pPr>
-      <w:r>
-        <w:rPr>
-          <w:rFonts w:ascii="Microsoft YaHei" w:hAnsi="Microsoft YaHei"/>
-        </w:rPr>
-        <w:t>4.4 Object.defineProperty 自引用描述符</w:t>
-      </w:r>
-    </w:p>
-    <w:p>
-      <w:r>
-        <w:rPr>
-          <w:rFonts w:ascii="Microsoft YaHei" w:hAnsi="Microsoft YaHei"/>
-          <w:b w:val="0"/>
-          <w:i w:val="0"/>
-          <w:sz w:val="22"/>
-        </w:rPr>
-        <w:t>问题：描述符对象和目标对象是同一个引用时，读取和写入互相干扰。</w:t>
-      </w:r>
-    </w:p>
-    <w:p>
-      <w:r>
-        <w:rPr>
-          <w:rFonts w:ascii="Microsoft YaHei" w:hAnsi="Microsoft YaHei"/>
-          <w:b w:val="0"/>
-          <w:i w:val="0"/>
-          <w:sz w:val="22"/>
-        </w:rPr>
-        <w:t>解决方法：先完整读取描述符的所有字段到局部变量，再执行属性写入。</w:t>
-      </w:r>
-    </w:p>
-    <w:p>
-      <w:pPr>
-        <w:pStyle w:val="Heading2"/>
-      </w:pPr>
-      <w:r>
-        <w:rPr>
-          <w:rFonts w:ascii="Microsoft YaHei" w:hAnsi="Microsoft YaHei"/>
-        </w:rPr>
-        <w:t>4.5 Array.prototype.forEach 的实时迭代</w:t>
-      </w:r>
-    </w:p>
-    <w:p>
-      <w:r>
-        <w:rPr>
-          <w:rFonts w:ascii="Microsoft YaHei" w:hAnsi="Microsoft YaHei"/>
-          <w:b w:val="0"/>
-          <w:i w:val="0"/>
-          <w:sz w:val="22"/>
-        </w:rPr>
-        <w:t>问题：forEach 的回调可能修改源数组，需要读取实时状态。</w:t>
-      </w:r>
-    </w:p>
-    <w:p>
-      <w:r>
-        <w:rPr>
-          <w:rFonts w:ascii="Microsoft YaHei" w:hAnsi="Microsoft YaHei"/>
-          <w:b w:val="0"/>
-          <w:i w:val="0"/>
-          <w:sz w:val="22"/>
-        </w:rPr>
-        <w:t>解决方法：先记录初始长度，每次迭代从源数组读取当前值。</w:t>
-      </w:r>
-    </w:p>
-    <w:p>
-      <w:pPr>
-        <w:pStyle w:val="Heading2"/>
-      </w:pPr>
-      <w:r>
-        <w:rPr>
-          <w:rFonts w:ascii="Microsoft YaHei" w:hAnsi="Microsoft YaHei"/>
-        </w:rPr>
-        <w:t>4.6 自动分号插入（ASI）的简化处理</w:t>
-      </w:r>
-    </w:p>
-    <w:p>
-      <w:r>
-        <w:rPr>
-          <w:rFonts w:ascii="Microsoft YaHei" w:hAnsi="Microsoft YaHei"/>
-          <w:b w:val="0"/>
-          <w:i w:val="0"/>
-          <w:sz w:val="22"/>
-        </w:rPr>
-        <w:t>问题：JS 的自动分号插入规则复杂。</w:t>
-      </w:r>
-    </w:p>
-    <w:p>
-      <w:r>
-        <w:rPr>
-          <w:rFonts w:ascii="Microsoft YaHei" w:hAnsi="Microsoft YaHei"/>
-          <w:b w:val="0"/>
-          <w:i w:val="0"/>
-          <w:sz w:val="22"/>
-        </w:rPr>
-        <w:t>解决方法：实现简化版 ASI，通过 optional_semicolon 方法可选消费分号，结合换行检测判断语句结束。</w:t>
-      </w:r>
-    </w:p>
-    <w:p>
-      <w:pPr>
-        <w:pStyle w:val="Heading2"/>
-      </w:pPr>
-      <w:r>
-        <w:rPr>
-          <w:rFonts w:ascii="Microsoft YaHei" w:hAnsi="Microsoft YaHei"/>
-        </w:rPr>
-        <w:t>4.7 字符串原型方法的自动装箱</w:t>
-      </w:r>
-    </w:p>
-    <w:p>
-      <w:r>
-        <w:rPr>
-          <w:rFonts w:ascii="Microsoft YaHei" w:hAnsi="Microsoft YaHei"/>
-          <w:b w:val="0"/>
-          <w:i w:val="0"/>
-          <w:sz w:val="22"/>
-        </w:rPr>
-        <w:t>问题：字符串字面量上调用方法需要临时装箱。</w:t>
-      </w:r>
-    </w:p>
-    <w:p>
-      <w:r>
-        <w:rPr>
-          <w:rFonts w:ascii="Microsoft YaHei" w:hAnsi="Microsoft YaHei"/>
-          <w:b w:val="0"/>
-          <w:i w:val="0"/>
-          <w:sz w:val="22"/>
-        </w:rPr>
-        <w:t>解决方法：在 get_property_on_value 中，对原始类型分别查找对应的原型对象。</w:t>
-      </w:r>
-    </w:p>
-    <w:p>
-      <w:pPr>
-        <w:pStyle w:val="Heading2"/>
-      </w:pPr>
-      <w:r>
-        <w:rPr>
-          <w:rFonts w:ascii="Microsoft YaHei" w:hAnsi="Microsoft YaHei"/>
-        </w:rPr>
-        <w:t>4.8 调用深度限制的递归计数</w:t>
-      </w:r>
-    </w:p>
-    <w:p>
-      <w:r>
-        <w:rPr>
-          <w:rFonts w:ascii="Microsoft YaHei" w:hAnsi="Microsoft YaHei"/>
-          <w:b w:val="0"/>
-          <w:i w:val="0"/>
-          <w:sz w:val="22"/>
-        </w:rPr>
-        <w:t>问题：递归调用需要准确计数深度，超出限制时正确恢复。</w:t>
-      </w:r>
-    </w:p>
-    <w:p>
-      <w:r>
-        <w:rPr>
-          <w:rFonts w:ascii="Microsoft YaHei" w:hAnsi="Microsoft YaHei"/>
-          <w:b w:val="0"/>
-          <w:i w:val="0"/>
-          <w:sz w:val="22"/>
-        </w:rPr>
-        <w:t>解决方法：enter_call 自增深度并检查限制，leave_call 自减深度，错误时先恢复再返回。</w:t>
-      </w:r>
-    </w:p>
-    <w:p>
-      <w:pPr>
-        <w:pStyle w:val="Heading1"/>
-      </w:pPr>
-      <w:r>
-        <w:rPr>
-          <w:rFonts w:ascii="Microsoft YaHei" w:hAnsi="Microsoft YaHei"/>
-        </w:rPr>
-        <w:t>五、非本队来源说明</w:t>
-      </w:r>
-    </w:p>
-    <w:p>
-      <w:pPr>
-        <w:pStyle w:val="Heading2"/>
-      </w:pPr>
-      <w:r>
-        <w:rPr>
-          <w:rFonts w:ascii="Microsoft YaHei" w:hAnsi="Microsoft YaHei"/>
-        </w:rPr>
-        <w:t>5.1 代码来源</w:t>
-      </w:r>
-    </w:p>
-    <w:p>
-      <w:r>
-        <w:rPr>
-          <w:rFonts w:ascii="Microsoft YaHei" w:hAnsi="Microsoft YaHei"/>
-          <w:b w:val="0"/>
-          <w:i w:val="0"/>
-          <w:sz w:val="22"/>
-        </w:rPr>
-        <w:t>本项目所有代码均为原创，无外部代码引入。</w:t>
-      </w:r>
-    </w:p>
-    <w:p>
-      <w:r>
-        <w:rPr>
-          <w:rFonts w:ascii="Microsoft YaHei" w:hAnsi="Microsoft YaHei"/>
-          <w:b w:val="0"/>
-          <w:i w:val="0"/>
-          <w:sz w:val="22"/>
-        </w:rPr>
-        <w:t>• Cargo.toml 依赖为空：项目不依赖任何第三方 Rust crate</w:t>
-      </w:r>
-    </w:p>
-    <w:p>
-      <w:r>
-        <w:rPr>
-          <w:rFonts w:ascii="Microsoft YaHei" w:hAnsi="Microsoft YaHei"/>
-          <w:b w:val="0"/>
-          <w:i w:val="0"/>
-          <w:sz w:val="22"/>
-        </w:rPr>
-        <w:t>• 非套壳声明：不是 QuickJS、Boa、V8、Node.js 或 Deno 的包装</w:t>
-      </w:r>
-    </w:p>
-    <w:p>
-      <w:r>
-        <w:rPr>
-          <w:rFonts w:ascii="Microsoft YaHei" w:hAnsi="Microsoft YaHei"/>
-          <w:b w:val="0"/>
-          <w:i w:val="0"/>
-          <w:sz w:val="22"/>
-        </w:rPr>
-        <w:t>• 词法分析器、语法分析器、AST、运行时值模型、解释器、Agent 接口均为自研实现</w:t>
-      </w:r>
-    </w:p>
-    <w:p>
-      <w:pPr>
-        <w:pStyle w:val="Heading2"/>
-      </w:pPr>
-      <w:r>
-        <w:rPr>
-          <w:rFonts w:ascii="Microsoft YaHei" w:hAnsi="Microsoft YaHei"/>
-        </w:rPr>
-        <w:t>5.2 参考标准</w:t>
-      </w:r>
-    </w:p>
-    <w:p>
-      <w:r>
-        <w:rPr>
-          <w:rFonts w:ascii="Microsoft YaHei" w:hAnsi="Microsoft YaHei"/>
-          <w:b w:val="0"/>
-          <w:i w:val="0"/>
-          <w:sz w:val="22"/>
-        </w:rPr>
-        <w:t>• ECMAScript 语言规范（ECMA-262）：作为 JavaScript 语义的参考标准，未复制规范代码</w:t>
-      </w:r>
-    </w:p>
-    <w:p>
-      <w:r>
-        <w:rPr>
-          <w:rFonts w:ascii="Microsoft YaHei" w:hAnsi="Microsoft YaHei"/>
-          <w:b w:val="0"/>
-          <w:i w:val="0"/>
-          <w:sz w:val="22"/>
-        </w:rPr>
-        <w:t>• JetStream 基准测试：README 中提及作为未来性能测试方向的参考（概念性参考，非代码）</w:t>
-      </w:r>
-    </w:p>
-    <w:p>
-      <w:pPr>
-        <w:pStyle w:val="Heading2"/>
-      </w:pPr>
-      <w:r>
-        <w:rPr>
-          <w:rFonts w:ascii="Microsoft YaHei" w:hAnsi="Microsoft YaHei"/>
-        </w:rPr>
-        <w:t>5.3 文档翻译</w:t>
-      </w:r>
-    </w:p>
-    <w:p>
-      <w:r>
-        <w:rPr>
-          <w:rFonts w:ascii="Microsoft YaHei" w:hAnsi="Microsoft YaHei"/>
-          <w:b w:val="0"/>
-          <w:i w:val="0"/>
-          <w:sz w:val="22"/>
-        </w:rPr>
-        <w:t>README-zh-cn.md、docs/agent-tool-zh-cn.md、docs/language-subset-zh-cn.md 是英文文档的中文翻译版本。</w:t>
-      </w:r>
-    </w:p>
-    <w:p>
-      <w:pPr>
-        <w:pStyle w:val="Heading1"/>
-      </w:pPr>
-      <w:r>
-        <w:rPr>
-          <w:rFonts w:ascii="Microsoft YaHei" w:hAnsi="Microsoft YaHei"/>
-        </w:rPr>
-        <w:t>六、AI 工具及大模型使用场景</w:t>
-      </w:r>
-    </w:p>
-    <w:tbl>
-      <w:tblPr>
-        <w:tblStyle w:val="LightGrid-Accent1"/>
-        <w:tblW w:type="auto" w:w="0"/>
-        <w:jc w:val="center"/>
-        <w:tblLook w:firstColumn="1" w:firstRow="1" w:lastColumn="0" w:lastRow="0" w:noHBand="0" w:noVBand="1" w:val="04A0"/>
-      </w:tblPr>
-      <w:tblGrid>
-        <w:gridCol w:w="4703"/>
-        <w:gridCol w:w="4703"/>
-      </w:tblGrid>
-      <w:tr>
-        <w:tc>
-          <w:tcPr>
-            <w:tcW w:type="dxa" w:w="4703"/>
-          </w:tcPr>
-          <w:p>
-            <w:r>
-              <w:rPr>
-                <w:rFonts w:ascii="Microsoft YaHei" w:hAnsi="Microsoft YaHei"/>
-                <w:b/>
-                <w:sz w:val="20"/>
-              </w:rPr>
-              <w:t>工具/模型</w:t>
-            </w:r>
-          </w:p>
-        </w:tc>
-        <w:tc>
-          <w:tcPr>
-            <w:tcW w:type="dxa" w:w="4703"/>
-          </w:tcPr>
-          <w:p>
-            <w:r>
-              <w:rPr>
-                <w:rFonts w:ascii="Microsoft YaHei" w:hAnsi="Microsoft YaHei"/>
-                <w:b/>
-                <w:sz w:val="20"/>
-              </w:rPr>
-              <w:t>使用场景</w:t>
-            </w:r>
-          </w:p>
-        </w:tc>
-      </w:tr>
-      <w:tr>
-        <w:tc>
-          <w:tcPr>
-            <w:tcW w:type="dxa" w:w="4703"/>
-          </w:tcPr>
-          <w:p>
-            <w:r>
-              <w:rPr>
-                <w:rFonts w:ascii="Microsoft YaHei" w:hAnsi="Microsoft YaHei"/>
-                <w:sz w:val="20"/>
-              </w:rPr>
-              <w:t>OpenCode (Claude Code)</w:t>
-            </w:r>
-          </w:p>
-        </w:tc>
-        <w:tc>
-          <w:tcPr>
-            <w:tcW w:type="dxa" w:w="4703"/>
-          </w:tcPr>
-          <w:p>
-            <w:r>
-              <w:rPr>
-                <w:rFonts w:ascii="Microsoft YaHei" w:hAnsi="Microsoft YaHei"/>
-                <w:sz w:val="20"/>
-              </w:rPr>
-              <w:t>代码生成、代码审查、调试辅助、文档编写、测试编写</w:t>
-            </w:r>
-          </w:p>
-        </w:tc>
-      </w:tr>
-      <w:tr>
-        <w:tc>
-          <w:tcPr>
-            <w:tcW w:type="dxa" w:w="4703"/>
-          </w:tcPr>
-          <w:p>
-            <w:r>
-              <w:rPr>
-                <w:rFonts w:ascii="Microsoft YaHei" w:hAnsi="Microsoft YaHei"/>
-                <w:sz w:val="20"/>
-              </w:rPr>
-              <w:t>Claude（Anthropic）</w:t>
-            </w:r>
-          </w:p>
-        </w:tc>
-        <w:tc>
-          <w:tcPr>
-            <w:tcW w:type="dxa" w:w="4703"/>
-          </w:tcPr>
-          <w:p>
-            <w:r>
-              <w:rPr>
-                <w:rFonts w:ascii="Microsoft YaHei" w:hAnsi="Microsoft YaHei"/>
-                <w:sz w:val="20"/>
-              </w:rPr>
-              <w:t>架构设计讨论、问题排查、代码优化建议</w:t>
-            </w:r>
-          </w:p>
-        </w:tc>
-      </w:tr>
-    </w:tbl>
-    <w:p/>
-    <w:p>
-      <w:r>
-        <w:rPr>
-          <w:rFonts w:ascii="Microsoft YaHei" w:hAnsi="Microsoft YaHei"/>
-          <w:b w:val="0"/>
-          <w:i w:val="0"/>
-          <w:sz w:val="22"/>
-        </w:rPr>
-        <w:t>AI 工具主要用于辅助编码、调试和文档编写。所有代码均由团队成员审查和修改，AI 生成的代码仅作为起点。项目架构设计和关键决策由团队主导。</w:t>
-      </w:r>
-    </w:p>
-    <w:p>
-      <w:pPr>
-        <w:pStyle w:val="Heading1"/>
-      </w:pPr>
-      <w:r>
-        <w:rPr>
-          <w:rFonts w:ascii="Microsoft YaHei" w:hAnsi="Microsoft YaHei"/>
-        </w:rPr>
-        <w:t>七、开发过程总结</w:t>
-      </w:r>
-    </w:p>
-    <w:p>
-      <w:pPr>
-        <w:pStyle w:val="Heading2"/>
-      </w:pPr>
-      <w:r>
-        <w:rPr>
-          <w:rFonts w:ascii="Microsoft YaHei" w:hAnsi="Microsoft YaHei"/>
-        </w:rPr>
-        <w:t>7.1 开发阶段</w:t>
+        <w:t>项目包含 71 个单元测试，全部通过。</w:t>
       </w:r>
     </w:p>
     <w:tbl>
@@ -1480,7 +1782,7 @@
                 <w:b/>
                 <w:sz w:val="20"/>
               </w:rPr>
-              <w:t>阶段</w:t>
+              <w:t>测试模块</w:t>
             </w:r>
           </w:p>
         </w:tc>
@@ -1495,7 +1797,897 @@
                 <w:b/>
                 <w:sz w:val="20"/>
               </w:rPr>
-              <w:t>提交数</w:t>
+              <w:t>位置</w:t>
+            </w:r>
+          </w:p>
+        </w:tc>
+        <w:tc>
+          <w:tcPr>
+            <w:tcW w:type="dxa" w:w="3135"/>
+          </w:tcPr>
+          <w:p>
+            <w:r>
+              <w:rPr>
+                <w:rFonts w:ascii="Microsoft YaHei" w:hAnsi="Microsoft YaHei"/>
+                <w:b/>
+                <w:sz w:val="20"/>
+              </w:rPr>
+              <w:t>覆盖内容</w:t>
+            </w:r>
+          </w:p>
+        </w:tc>
+      </w:tr>
+      <w:tr>
+        <w:tc>
+          <w:tcPr>
+            <w:tcW w:type="dxa" w:w="3135"/>
+          </w:tcPr>
+          <w:p>
+            <w:r>
+              <w:rPr>
+                <w:rFonts w:ascii="Microsoft YaHei" w:hAnsi="Microsoft YaHei"/>
+                <w:sz w:val="20"/>
+              </w:rPr>
+              <w:t>lexer 测试</w:t>
+            </w:r>
+          </w:p>
+        </w:tc>
+        <w:tc>
+          <w:tcPr>
+            <w:tcW w:type="dxa" w:w="3135"/>
+          </w:tcPr>
+          <w:p>
+            <w:r>
+              <w:rPr>
+                <w:rFonts w:ascii="Microsoft YaHei" w:hAnsi="Microsoft YaHei"/>
+                <w:sz w:val="20"/>
+              </w:rPr>
+              <w:t>src/lexer.rs</w:t>
+            </w:r>
+          </w:p>
+        </w:tc>
+        <w:tc>
+          <w:tcPr>
+            <w:tcW w:type="dxa" w:w="3135"/>
+          </w:tcPr>
+          <w:p>
+            <w:r>
+              <w:rPr>
+                <w:rFonts w:ascii="Microsoft YaHei" w:hAnsi="Microsoft YaHei"/>
+                <w:sz w:val="20"/>
+              </w:rPr>
+              <w:t>注释解析、非法字符串检测</w:t>
+            </w:r>
+          </w:p>
+        </w:tc>
+      </w:tr>
+      <w:tr>
+        <w:tc>
+          <w:tcPr>
+            <w:tcW w:type="dxa" w:w="3135"/>
+          </w:tcPr>
+          <w:p>
+            <w:r>
+              <w:rPr>
+                <w:rFonts w:ascii="Microsoft YaHei" w:hAnsi="Microsoft YaHei"/>
+                <w:sz w:val="20"/>
+              </w:rPr>
+              <w:t>parser 测试</w:t>
+            </w:r>
+          </w:p>
+        </w:tc>
+        <w:tc>
+          <w:tcPr>
+            <w:tcW w:type="dxa" w:w="3135"/>
+          </w:tcPr>
+          <w:p>
+            <w:r>
+              <w:rPr>
+                <w:rFonts w:ascii="Microsoft YaHei" w:hAnsi="Microsoft YaHei"/>
+                <w:sz w:val="20"/>
+              </w:rPr>
+              <w:t>src/parser.rs</w:t>
+            </w:r>
+          </w:p>
+        </w:tc>
+        <w:tc>
+          <w:tcPr>
+            <w:tcW w:type="dxa" w:w="3135"/>
+          </w:tcPr>
+          <w:p>
+            <w:r>
+              <w:rPr>
+                <w:rFonts w:ascii="Microsoft YaHei" w:hAnsi="Microsoft YaHei"/>
+                <w:sz w:val="20"/>
+              </w:rPr>
+              <w:t>表达式优先级、函数解析、未初始化 let</w:t>
+            </w:r>
+          </w:p>
+        </w:tc>
+      </w:tr>
+      <w:tr>
+        <w:tc>
+          <w:tcPr>
+            <w:tcW w:type="dxa" w:w="3135"/>
+          </w:tcPr>
+          <w:p>
+            <w:r>
+              <w:rPr>
+                <w:rFonts w:ascii="Microsoft YaHei" w:hAnsi="Microsoft YaHei"/>
+                <w:sz w:val="20"/>
+              </w:rPr>
+              <w:t>interpreter 测试</w:t>
+            </w:r>
+          </w:p>
+        </w:tc>
+        <w:tc>
+          <w:tcPr>
+            <w:tcW w:type="dxa" w:w="3135"/>
+          </w:tcPr>
+          <w:p>
+            <w:r>
+              <w:rPr>
+                <w:rFonts w:ascii="Microsoft YaHei" w:hAnsi="Microsoft YaHei"/>
+                <w:sz w:val="20"/>
+              </w:rPr>
+              <w:t>src/interpreter.rs</w:t>
+            </w:r>
+          </w:p>
+        </w:tc>
+        <w:tc>
+          <w:tcPr>
+            <w:tcW w:type="dxa" w:w="3135"/>
+          </w:tcPr>
+          <w:p>
+            <w:r>
+              <w:rPr>
+                <w:rFonts w:ascii="Microsoft YaHei" w:hAnsi="Microsoft YaHei"/>
+                <w:sz w:val="20"/>
+              </w:rPr>
+              <w:t>60+ 测试覆盖所有核心功能</w:t>
+            </w:r>
+          </w:p>
+        </w:tc>
+      </w:tr>
+      <w:tr>
+        <w:tc>
+          <w:tcPr>
+            <w:tcW w:type="dxa" w:w="3135"/>
+          </w:tcPr>
+          <w:p>
+            <w:r>
+              <w:rPr>
+                <w:rFonts w:ascii="Microsoft YaHei" w:hAnsi="Microsoft YaHei"/>
+                <w:sz w:val="20"/>
+              </w:rPr>
+              <w:t>agent 测试</w:t>
+            </w:r>
+          </w:p>
+        </w:tc>
+        <w:tc>
+          <w:tcPr>
+            <w:tcW w:type="dxa" w:w="3135"/>
+          </w:tcPr>
+          <w:p>
+            <w:r>
+              <w:rPr>
+                <w:rFonts w:ascii="Microsoft YaHei" w:hAnsi="Microsoft YaHei"/>
+                <w:sz w:val="20"/>
+              </w:rPr>
+              <w:t>src/agent.rs</w:t>
+            </w:r>
+          </w:p>
+        </w:tc>
+        <w:tc>
+          <w:tcPr>
+            <w:tcW w:type="dxa" w:w="3135"/>
+          </w:tcPr>
+          <w:p>
+            <w:r>
+              <w:rPr>
+                <w:rFonts w:ascii="Microsoft YaHei" w:hAnsi="Microsoft YaHei"/>
+                <w:sz w:val="20"/>
+              </w:rPr>
+              <w:t>结构化结果、错误分类、资源限制</w:t>
+            </w:r>
+          </w:p>
+        </w:tc>
+      </w:tr>
+      <w:tr>
+        <w:tc>
+          <w:tcPr>
+            <w:tcW w:type="dxa" w:w="3135"/>
+          </w:tcPr>
+          <w:p>
+            <w:r>
+              <w:rPr>
+                <w:rFonts w:ascii="Microsoft YaHei" w:hAnsi="Microsoft YaHei"/>
+                <w:sz w:val="20"/>
+              </w:rPr>
+              <w:t>lib 测试</w:t>
+            </w:r>
+          </w:p>
+        </w:tc>
+        <w:tc>
+          <w:tcPr>
+            <w:tcW w:type="dxa" w:w="3135"/>
+          </w:tcPr>
+          <w:p>
+            <w:r>
+              <w:rPr>
+                <w:rFonts w:ascii="Microsoft YaHei" w:hAnsi="Microsoft YaHei"/>
+                <w:sz w:val="20"/>
+              </w:rPr>
+              <w:t>src/lib.rs</w:t>
+            </w:r>
+          </w:p>
+        </w:tc>
+        <w:tc>
+          <w:tcPr>
+            <w:tcW w:type="dxa" w:w="3135"/>
+          </w:tcPr>
+          <w:p>
+            <w:r>
+              <w:rPr>
+                <w:rFonts w:ascii="Microsoft YaHei" w:hAnsi="Microsoft YaHei"/>
+                <w:sz w:val="20"/>
+              </w:rPr>
+              <w:t>端到端执行、运算符、函数、循环、typeof</w:t>
+            </w:r>
+          </w:p>
+        </w:tc>
+      </w:tr>
+      <w:tr>
+        <w:tc>
+          <w:tcPr>
+            <w:tcW w:type="dxa" w:w="3135"/>
+          </w:tcPr>
+          <w:p>
+            <w:r>
+              <w:rPr>
+                <w:rFonts w:ascii="Microsoft YaHei" w:hAnsi="Microsoft YaHei"/>
+                <w:sz w:val="20"/>
+              </w:rPr>
+              <w:t>CLI 集成测试</w:t>
+            </w:r>
+          </w:p>
+        </w:tc>
+        <w:tc>
+          <w:tcPr>
+            <w:tcW w:type="dxa" w:w="3135"/>
+          </w:tcPr>
+          <w:p>
+            <w:r>
+              <w:rPr>
+                <w:rFonts w:ascii="Microsoft YaHei" w:hAnsi="Microsoft YaHei"/>
+                <w:sz w:val="20"/>
+              </w:rPr>
+              <w:t>tests/cli.rs</w:t>
+            </w:r>
+          </w:p>
+        </w:tc>
+        <w:tc>
+          <w:tcPr>
+            <w:tcW w:type="dxa" w:w="3135"/>
+          </w:tcPr>
+          <w:p>
+            <w:r>
+              <w:rPr>
+                <w:rFonts w:ascii="Microsoft YaHei" w:hAnsi="Microsoft YaHei"/>
+                <w:sz w:val="20"/>
+              </w:rPr>
+              <w:t>CLI 执行、参数解析</w:t>
+            </w:r>
+          </w:p>
+        </w:tc>
+      </w:tr>
+    </w:tbl>
+    <w:p>
+      <w:pPr>
+        <w:pStyle w:val="Heading2"/>
+      </w:pPr>
+      <w:r>
+        <w:rPr>
+          <w:rFonts w:ascii="Microsoft YaHei" w:hAnsi="Microsoft YaHei"/>
+        </w:rPr>
+        <w:t>6.2 测试覆盖范围</w:t>
+      </w:r>
+    </w:p>
+    <w:p>
+      <w:r>
+        <w:rPr>
+          <w:rFonts w:ascii="Microsoft YaHei" w:hAnsi="Microsoft YaHei"/>
+          <w:b w:val="0"/>
+          <w:i w:val="0"/>
+          <w:sz w:val="22"/>
+        </w:rPr>
+        <w:t>算术运算、函数定义与闭包、控制流（if/else/while/for/switch/break/continue）、异常处理、对象与数组、运算符（typeof/instanceof/抽象相等/严格相等）、资源限制（步数/深度/输出）、标准库各方法、Agent 模式 JSON 输出。</w:t>
+      </w:r>
+    </w:p>
+    <w:p>
+      <w:pPr>
+        <w:pStyle w:val="Heading2"/>
+      </w:pPr>
+      <w:r>
+        <w:rPr>
+          <w:rFonts w:ascii="Microsoft YaHei" w:hAnsi="Microsoft YaHei"/>
+        </w:rPr>
+        <w:t>6.3 test262 测试</w:t>
+      </w:r>
+    </w:p>
+    <w:p>
+      <w:r>
+        <w:rPr>
+          <w:rFonts w:ascii="Microsoft YaHei" w:hAnsi="Microsoft YaHei"/>
+          <w:b w:val="0"/>
+          <w:i w:val="0"/>
+          <w:sz w:val="22"/>
+        </w:rPr>
+        <w:t>项目提供了 run_test262.py 测试运行器，需要外部 test262 checkout 配合使用。当前引擎尚未运行完整的 test262 测试套件，后续计划推进 test262 子集覆盖。</w:t>
+      </w:r>
+    </w:p>
+    <w:p>
+      <w:pPr>
+        <w:pStyle w:val="Heading1"/>
+      </w:pPr>
+      <w:r>
+        <w:rPr>
+          <w:rFonts w:ascii="Microsoft YaHei" w:hAnsi="Microsoft YaHei"/>
+        </w:rPr>
+        <w:t>七、遇到的主要问题和解决方法</w:t>
+      </w:r>
+    </w:p>
+    <w:p>
+      <w:r>
+        <w:rPr>
+          <w:rFonts w:ascii="Microsoft YaHei" w:hAnsi="Microsoft YaHei"/>
+          <w:b/>
+          <w:i w:val="0"/>
+          <w:sz w:val="22"/>
+        </w:rPr>
+        <w:t>7.1 Rust 所有权与 JS 引用语义的冲突</w:t>
+      </w:r>
+    </w:p>
+    <w:p>
+      <w:r>
+        <w:rPr>
+          <w:rFonts w:ascii="Microsoft YaHei" w:hAnsi="Microsoft YaHei"/>
+          <w:b w:val="0"/>
+          <w:i w:val="0"/>
+          <w:sz w:val="22"/>
+        </w:rPr>
+        <w:t>问题：JS 对象是引用类型，Rust 所有权不允许共享可变引用。解决：采用 Rc&lt;RefCell&lt;Object&gt;&gt; 模式。</w:t>
+      </w:r>
+    </w:p>
+    <w:p>
+      <w:r>
+        <w:rPr>
+          <w:rFonts w:ascii="Microsoft YaHei" w:hAnsi="Microsoft YaHei"/>
+          <w:b/>
+          <w:i w:val="0"/>
+          <w:sz w:val="22"/>
+        </w:rPr>
+        <w:t>7.2 闭包环境捕获</w:t>
+      </w:r>
+    </w:p>
+    <w:p>
+      <w:r>
+        <w:rPr>
+          <w:rFonts w:ascii="Microsoft YaHei" w:hAnsi="Microsoft YaHei"/>
+          <w:b w:val="0"/>
+          <w:i w:val="0"/>
+          <w:sz w:val="22"/>
+        </w:rPr>
+        <w:t>问题：闭包需捕获定义时环境，但环境可能后续变化。解决：make_function 时将环境指针存入 HashMap。</w:t>
+      </w:r>
+    </w:p>
+    <w:p>
+      <w:r>
+        <w:rPr>
+          <w:rFonts w:ascii="Microsoft YaHei" w:hAnsi="Microsoft YaHei"/>
+          <w:b/>
+          <w:i w:val="0"/>
+          <w:sz w:val="22"/>
+        </w:rPr>
+        <w:t>7.3 数组空洞与 undefined 区分</w:t>
+      </w:r>
+    </w:p>
+    <w:p>
+      <w:r>
+        <w:rPr>
+          <w:rFonts w:ascii="Microsoft YaHei" w:hAnsi="Microsoft YaHei"/>
+          <w:b w:val="0"/>
+          <w:i w:val="0"/>
+          <w:sz w:val="22"/>
+        </w:rPr>
+        <w:t>问题：JS 数组空洞返回 undefined 但 hasOwnProperty 为 false。解决：Vec&lt;Option&lt;Value&gt;&gt;，None 表示空洞。</w:t>
+      </w:r>
+    </w:p>
+    <w:p>
+      <w:r>
+        <w:rPr>
+          <w:rFonts w:ascii="Microsoft YaHei" w:hAnsi="Microsoft YaHei"/>
+          <w:b/>
+          <w:i w:val="0"/>
+          <w:sz w:val="22"/>
+        </w:rPr>
+        <w:t>7.4 Object.defineProperty 自引用描述符</w:t>
+      </w:r>
+    </w:p>
+    <w:p>
+      <w:r>
+        <w:rPr>
+          <w:rFonts w:ascii="Microsoft YaHei" w:hAnsi="Microsoft YaHei"/>
+          <w:b w:val="0"/>
+          <w:i w:val="0"/>
+          <w:sz w:val="22"/>
+        </w:rPr>
+        <w:t>问题：描述符和目标对象同一引用时读写干扰。解决：先完整读取字段到局部变量再写入。</w:t>
+      </w:r>
+    </w:p>
+    <w:p>
+      <w:r>
+        <w:rPr>
+          <w:rFonts w:ascii="Microsoft YaHei" w:hAnsi="Microsoft YaHei"/>
+          <w:b/>
+          <w:i w:val="0"/>
+          <w:sz w:val="22"/>
+        </w:rPr>
+        <w:t>7.5 Array.prototype.forEach 实时迭代</w:t>
+      </w:r>
+    </w:p>
+    <w:p>
+      <w:r>
+        <w:rPr>
+          <w:rFonts w:ascii="Microsoft YaHei" w:hAnsi="Microsoft YaHei"/>
+          <w:b w:val="0"/>
+          <w:i w:val="0"/>
+          <w:sz w:val="22"/>
+        </w:rPr>
+        <w:t>问题：回调可能修改源数组。解决：记录初始长度，每次迭代读取当前值。</w:t>
+      </w:r>
+    </w:p>
+    <w:p>
+      <w:r>
+        <w:rPr>
+          <w:rFonts w:ascii="Microsoft YaHei" w:hAnsi="Microsoft YaHei"/>
+          <w:b/>
+          <w:i w:val="0"/>
+          <w:sz w:val="22"/>
+        </w:rPr>
+        <w:t>7.6 自动分号插入（ASI）</w:t>
+      </w:r>
+    </w:p>
+    <w:p>
+      <w:r>
+        <w:rPr>
+          <w:rFonts w:ascii="Microsoft YaHei" w:hAnsi="Microsoft YaHei"/>
+          <w:b w:val="0"/>
+          <w:i w:val="0"/>
+          <w:sz w:val="22"/>
+        </w:rPr>
+        <w:t>问题：JS ASI 规则复杂。解决：optional_semicolon 结合换行检测。</w:t>
+      </w:r>
+    </w:p>
+    <w:p>
+      <w:r>
+        <w:rPr>
+          <w:rFonts w:ascii="Microsoft YaHei" w:hAnsi="Microsoft YaHei"/>
+          <w:b/>
+          <w:i w:val="0"/>
+          <w:sz w:val="22"/>
+        </w:rPr>
+        <w:t>7.7 字符串原型方法自动装箱</w:t>
+      </w:r>
+    </w:p>
+    <w:p>
+      <w:r>
+        <w:rPr>
+          <w:rFonts w:ascii="Microsoft YaHei" w:hAnsi="Microsoft YaHei"/>
+          <w:b w:val="0"/>
+          <w:i w:val="0"/>
+          <w:sz w:val="22"/>
+        </w:rPr>
+        <w:t>问题：原始类型上调用方法需临时装箱。解决：get_property_on_value 中查找对应原型对象。</w:t>
+      </w:r>
+    </w:p>
+    <w:p>
+      <w:r>
+        <w:rPr>
+          <w:rFonts w:ascii="Microsoft YaHei" w:hAnsi="Microsoft YaHei"/>
+          <w:b/>
+          <w:i w:val="0"/>
+          <w:sz w:val="22"/>
+        </w:rPr>
+        <w:t>7.8 调用深度限制的递归计数</w:t>
+      </w:r>
+    </w:p>
+    <w:p>
+      <w:r>
+        <w:rPr>
+          <w:rFonts w:ascii="Microsoft YaHei" w:hAnsi="Microsoft YaHei"/>
+          <w:b w:val="0"/>
+          <w:i w:val="0"/>
+          <w:sz w:val="22"/>
+        </w:rPr>
+        <w:t>问题：递归需准确计数深度，超出限制时恢复。解决：enter_call/leave_call 平衡计数。</w:t>
+      </w:r>
+    </w:p>
+    <w:p>
+      <w:pPr>
+        <w:pStyle w:val="Heading1"/>
+      </w:pPr>
+      <w:r>
+        <w:rPr>
+          <w:rFonts w:ascii="Microsoft YaHei" w:hAnsi="Microsoft YaHei"/>
+        </w:rPr>
+        <w:t>八、分工和协作</w:t>
+      </w:r>
+    </w:p>
+    <w:p>
+      <w:pPr>
+        <w:pStyle w:val="Heading2"/>
+      </w:pPr>
+      <w:r>
+        <w:rPr>
+          <w:rFonts w:ascii="Microsoft YaHei" w:hAnsi="Microsoft YaHei"/>
+        </w:rPr>
+        <w:t>8.1 团队成员</w:t>
+      </w:r>
+    </w:p>
+    <w:tbl>
+      <w:tblPr>
+        <w:tblStyle w:val="LightGrid-Accent1"/>
+        <w:tblW w:type="auto" w:w="0"/>
+        <w:jc w:val="center"/>
+        <w:tblLook w:firstColumn="1" w:firstRow="1" w:lastColumn="0" w:lastRow="0" w:noHBand="0" w:noVBand="1" w:val="04A0"/>
+      </w:tblPr>
+      <w:tblGrid>
+        <w:gridCol w:w="3135"/>
+        <w:gridCol w:w="3135"/>
+        <w:gridCol w:w="3135"/>
+      </w:tblGrid>
+      <w:tr>
+        <w:tc>
+          <w:tcPr>
+            <w:tcW w:type="dxa" w:w="3135"/>
+          </w:tcPr>
+          <w:p>
+            <w:r>
+              <w:rPr>
+                <w:rFonts w:ascii="Microsoft YaHei" w:hAnsi="Microsoft YaHei"/>
+                <w:b/>
+                <w:sz w:val="20"/>
+              </w:rPr>
+              <w:t>姓名</w:t>
+            </w:r>
+          </w:p>
+        </w:tc>
+        <w:tc>
+          <w:tcPr>
+            <w:tcW w:type="dxa" w:w="3135"/>
+          </w:tcPr>
+          <w:p>
+            <w:r>
+              <w:rPr>
+                <w:rFonts w:ascii="Microsoft YaHei" w:hAnsi="Microsoft YaHei"/>
+                <w:b/>
+                <w:sz w:val="20"/>
+              </w:rPr>
+              <w:t>角色</w:t>
+            </w:r>
+          </w:p>
+        </w:tc>
+        <w:tc>
+          <w:tcPr>
+            <w:tcW w:type="dxa" w:w="3135"/>
+          </w:tcPr>
+          <w:p>
+            <w:r>
+              <w:rPr>
+                <w:rFonts w:ascii="Microsoft YaHei" w:hAnsi="Microsoft YaHei"/>
+                <w:b/>
+                <w:sz w:val="20"/>
+              </w:rPr>
+              <w:t>主要职责</w:t>
+            </w:r>
+          </w:p>
+        </w:tc>
+      </w:tr>
+      <w:tr>
+        <w:tc>
+          <w:tcPr>
+            <w:tcW w:type="dxa" w:w="3135"/>
+          </w:tcPr>
+          <w:p>
+            <w:r>
+              <w:rPr>
+                <w:rFonts w:ascii="Microsoft YaHei" w:hAnsi="Microsoft YaHei"/>
+                <w:sz w:val="20"/>
+              </w:rPr>
+              <w:t>何禹颃</w:t>
+            </w:r>
+          </w:p>
+        </w:tc>
+        <w:tc>
+          <w:tcPr>
+            <w:tcW w:type="dxa" w:w="3135"/>
+          </w:tcPr>
+          <w:p>
+            <w:r>
+              <w:rPr>
+                <w:rFonts w:ascii="Microsoft YaHei" w:hAnsi="Microsoft YaHei"/>
+                <w:sz w:val="20"/>
+              </w:rPr>
+              <w:t>队长/核心架构师</w:t>
+            </w:r>
+          </w:p>
+        </w:tc>
+        <w:tc>
+          <w:tcPr>
+            <w:tcW w:type="dxa" w:w="3135"/>
+          </w:tcPr>
+          <w:p>
+            <w:r>
+              <w:rPr>
+                <w:rFonts w:ascii="Microsoft YaHei" w:hAnsi="Microsoft YaHei"/>
+                <w:sz w:val="20"/>
+              </w:rPr>
+              <w:t>项目架构设计、lexer/parser/解释器核心引擎、Agent 接口、代码审查</w:t>
+            </w:r>
+          </w:p>
+        </w:tc>
+      </w:tr>
+      <w:tr>
+        <w:tc>
+          <w:tcPr>
+            <w:tcW w:type="dxa" w:w="3135"/>
+          </w:tcPr>
+          <w:p>
+            <w:r>
+              <w:rPr>
+                <w:rFonts w:ascii="Microsoft YaHei" w:hAnsi="Microsoft YaHei"/>
+                <w:sz w:val="20"/>
+              </w:rPr>
+              <w:t>真笑君</w:t>
+            </w:r>
+          </w:p>
+        </w:tc>
+        <w:tc>
+          <w:tcPr>
+            <w:tcW w:type="dxa" w:w="3135"/>
+          </w:tcPr>
+          <w:p>
+            <w:r>
+              <w:rPr>
+                <w:rFonts w:ascii="Microsoft YaHei" w:hAnsi="Microsoft YaHei"/>
+                <w:sz w:val="20"/>
+              </w:rPr>
+              <w:t>队员/标准库开发</w:t>
+            </w:r>
+          </w:p>
+        </w:tc>
+        <w:tc>
+          <w:tcPr>
+            <w:tcW w:type="dxa" w:w="3135"/>
+          </w:tcPr>
+          <w:p>
+            <w:r>
+              <w:rPr>
+                <w:rFonts w:ascii="Microsoft YaHei" w:hAnsi="Microsoft YaHei"/>
+                <w:sz w:val="20"/>
+              </w:rPr>
+              <w:t>Object/Array/String 标准库、错误类型系统、单元测试、边界情况处理</w:t>
+            </w:r>
+          </w:p>
+        </w:tc>
+      </w:tr>
+      <w:tr>
+        <w:tc>
+          <w:tcPr>
+            <w:tcW w:type="dxa" w:w="3135"/>
+          </w:tcPr>
+          <w:p>
+            <w:r>
+              <w:rPr>
+                <w:rFonts w:ascii="Microsoft YaHei" w:hAnsi="Microsoft YaHei"/>
+                <w:sz w:val="20"/>
+              </w:rPr>
+              <w:t>李春雨</w:t>
+            </w:r>
+          </w:p>
+        </w:tc>
+        <w:tc>
+          <w:tcPr>
+            <w:tcW w:type="dxa" w:w="3135"/>
+          </w:tcPr>
+          <w:p>
+            <w:r>
+              <w:rPr>
+                <w:rFonts w:ascii="Microsoft YaHei" w:hAnsi="Microsoft YaHei"/>
+                <w:sz w:val="20"/>
+              </w:rPr>
+              <w:t>队员/功能扩展 &amp; 工程化</w:t>
+            </w:r>
+          </w:p>
+        </w:tc>
+        <w:tc>
+          <w:tcPr>
+            <w:tcW w:type="dxa" w:w="3135"/>
+          </w:tcPr>
+          <w:p>
+            <w:r>
+              <w:rPr>
+                <w:rFonts w:ascii="Microsoft YaHei" w:hAnsi="Microsoft YaHei"/>
+                <w:sz w:val="20"/>
+              </w:rPr>
+              <w:t>REPL、CLI、高级语法、Math 对象、test262 框架、文档编写</w:t>
+            </w:r>
+          </w:p>
+        </w:tc>
+      </w:tr>
+    </w:tbl>
+    <w:p>
+      <w:pPr>
+        <w:pStyle w:val="Heading2"/>
+      </w:pPr>
+      <w:r>
+        <w:rPr>
+          <w:rFonts w:ascii="Microsoft YaHei" w:hAnsi="Microsoft YaHei"/>
+        </w:rPr>
+        <w:t>8.2 协作方式</w:t>
+      </w:r>
+    </w:p>
+    <w:p>
+      <w:r>
+        <w:rPr>
+          <w:rFonts w:ascii="Microsoft YaHei" w:hAnsi="Microsoft YaHei"/>
+          <w:b w:val="0"/>
+          <w:i w:val="0"/>
+          <w:sz w:val="22"/>
+        </w:rPr>
+        <w:t>• 版本管理：使用 Git，采用 feature branch 工作流</w:t>
+      </w:r>
+    </w:p>
+    <w:p>
+      <w:r>
+        <w:rPr>
+          <w:rFonts w:ascii="Microsoft YaHei" w:hAnsi="Microsoft YaHei"/>
+          <w:b w:val="0"/>
+          <w:i w:val="0"/>
+          <w:sz w:val="22"/>
+        </w:rPr>
+        <w:t>• 代码审查：队长负责代码审查，合并前确认测试通过</w:t>
+      </w:r>
+    </w:p>
+    <w:p>
+      <w:r>
+        <w:rPr>
+          <w:rFonts w:ascii="Microsoft YaHei" w:hAnsi="Microsoft YaHei"/>
+          <w:b w:val="0"/>
+          <w:i w:val="0"/>
+          <w:sz w:val="22"/>
+        </w:rPr>
+        <w:t>• 沟通方式：即时通讯 + 面对面讨论</w:t>
+      </w:r>
+    </w:p>
+    <w:p>
+      <w:r>
+        <w:rPr>
+          <w:rFonts w:ascii="Microsoft YaHei" w:hAnsi="Microsoft YaHei"/>
+          <w:b w:val="0"/>
+          <w:i w:val="0"/>
+          <w:sz w:val="22"/>
+        </w:rPr>
+        <w:t>• 任务分配：基于个人技术特长分工，交叉协作解决难点</w:t>
+      </w:r>
+    </w:p>
+    <w:p>
+      <w:pPr>
+        <w:pStyle w:val="Heading2"/>
+      </w:pPr>
+      <w:r>
+        <w:rPr>
+          <w:rFonts w:ascii="Microsoft YaHei" w:hAnsi="Microsoft YaHei"/>
+        </w:rPr>
+        <w:t>8.3 开发流程</w:t>
+      </w:r>
+    </w:p>
+    <w:p>
+      <w:r>
+        <w:rPr>
+          <w:rFonts w:ascii="Microsoft YaHei" w:hAnsi="Microsoft YaHei"/>
+          <w:b w:val="0"/>
+          <w:i w:val="0"/>
+          <w:sz w:val="22"/>
+        </w:rPr>
+        <w:t>从 test/all-remote-branches 创建功能分支 → 实现功能并编写测试 → cargo test 验证 → 代码审查 → 合并</w:t>
+      </w:r>
+    </w:p>
+    <w:p>
+      <w:pPr>
+        <w:pStyle w:val="Heading1"/>
+      </w:pPr>
+      <w:r>
+        <w:rPr>
+          <w:rFonts w:ascii="Microsoft YaHei" w:hAnsi="Microsoft YaHei"/>
+        </w:rPr>
+        <w:t>九、提交仓库目录和文件描述</w:t>
+      </w:r>
+    </w:p>
+    <w:p>
+      <w:pPr>
+        <w:pStyle w:val="Heading2"/>
+      </w:pPr>
+      <w:r>
+        <w:rPr>
+          <w:rFonts w:ascii="Microsoft YaHei" w:hAnsi="Microsoft YaHei"/>
+        </w:rPr>
+        <w:t>9.1 目录结构</w:t>
+      </w:r>
+    </w:p>
+    <w:p>
+      <w:r>
+        <w:rPr>
+          <w:rFonts w:ascii="Microsoft YaHei" w:hAnsi="Microsoft YaHei"/>
+          <w:b w:val="0"/>
+          <w:i w:val="0"/>
+          <w:sz w:val="22"/>
+        </w:rPr>
+        <w:t>rjs_lite/ ├── Cargo.toml ├── Cargo.lock ├── README.md ├── README-zh-cn.md ├── run_test262.py ├── src/ │ ├── main.rs │ ├── lib.rs │ ├── lexer.rs │ ├── parser.rs │ ├── ast.rs │ ├── token.rs │ ├── value.rs │ ├── interpreter.rs │ ├── agent.rs │ └── error.rs ├── tests/ │ └── cli.rs ├── docs/ │ ├── agent-tool.md │ ├── agent-tool-zh-cn.md │ ├── language-subset.md │ ├── language-subset-zh-cn.md │ └── process/ │ ├── process-documentation.md │ └── process-documentation.docx ├── examples/ │ └── demo.js └── .gitignore</w:t>
+      </w:r>
+    </w:p>
+    <w:p>
+      <w:pPr>
+        <w:pStyle w:val="Heading2"/>
+      </w:pPr>
+      <w:r>
+        <w:rPr>
+          <w:rFonts w:ascii="Microsoft YaHei" w:hAnsi="Microsoft YaHei"/>
+        </w:rPr>
+        <w:t>9.2 核心文件说明</w:t>
+      </w:r>
+    </w:p>
+    <w:tbl>
+      <w:tblPr>
+        <w:tblStyle w:val="LightGrid-Accent1"/>
+        <w:tblW w:type="auto" w:w="0"/>
+        <w:jc w:val="center"/>
+        <w:tblLook w:firstColumn="1" w:firstRow="1" w:lastColumn="0" w:lastRow="0" w:noHBand="0" w:noVBand="1" w:val="04A0"/>
+      </w:tblPr>
+      <w:tblGrid>
+        <w:gridCol w:w="3135"/>
+        <w:gridCol w:w="3135"/>
+        <w:gridCol w:w="3135"/>
+      </w:tblGrid>
+      <w:tr>
+        <w:tc>
+          <w:tcPr>
+            <w:tcW w:type="dxa" w:w="3135"/>
+          </w:tcPr>
+          <w:p>
+            <w:r>
+              <w:rPr>
+                <w:rFonts w:ascii="Microsoft YaHei" w:hAnsi="Microsoft YaHei"/>
+                <w:b/>
+                <w:sz w:val="20"/>
+              </w:rPr>
+              <w:t>文件</w:t>
+            </w:r>
+          </w:p>
+        </w:tc>
+        <w:tc>
+          <w:tcPr>
+            <w:tcW w:type="dxa" w:w="3135"/>
+          </w:tcPr>
+          <w:p>
+            <w:r>
+              <w:rPr>
+                <w:rFonts w:ascii="Microsoft YaHei" w:hAnsi="Microsoft YaHei"/>
+                <w:b/>
+                <w:sz w:val="20"/>
+              </w:rPr>
+              <w:t>行数</w:t>
             </w:r>
           </w:p>
         </w:tc>
@@ -1526,7 +2718,7 @@
                 <w:rFonts w:ascii="Microsoft YaHei" w:hAnsi="Microsoft YaHei"/>
                 <w:sz w:val="20"/>
               </w:rPr>
-              <w:t>初始化阶段</w:t>
+              <w:t>src/lexer.rs</w:t>
             </w:r>
           </w:p>
         </w:tc>
@@ -1540,7 +2732,7 @@
                 <w:rFonts w:ascii="Microsoft YaHei" w:hAnsi="Microsoft YaHei"/>
                 <w:sz w:val="20"/>
               </w:rPr>
-              <w:t>~5</w:t>
+              <w:t>302</w:t>
             </w:r>
           </w:p>
         </w:tc>
@@ -1554,7 +2746,7 @@
                 <w:rFonts w:ascii="Microsoft YaHei" w:hAnsi="Microsoft YaHei"/>
                 <w:sz w:val="20"/>
               </w:rPr>
-              <w:t>搭建 Rust 脚手架，实现基础 lexer 和 parser</w:t>
+              <w:t>字符级词法分析器</w:t>
             </w:r>
           </w:p>
         </w:tc>
@@ -1570,7 +2762,7 @@
                 <w:rFonts w:ascii="Microsoft YaHei" w:hAnsi="Microsoft YaHei"/>
                 <w:sz w:val="20"/>
               </w:rPr>
-              <w:t>核心引擎阶段</w:t>
+              <w:t>src/parser.rs</w:t>
             </w:r>
           </w:p>
         </w:tc>
@@ -1584,7 +2776,7 @@
                 <w:rFonts w:ascii="Microsoft YaHei" w:hAnsi="Microsoft YaHei"/>
                 <w:sz w:val="20"/>
               </w:rPr>
-              <w:t>~15</w:t>
+              <w:t>748</w:t>
             </w:r>
           </w:p>
         </w:tc>
@@ -1598,7 +2790,7 @@
                 <w:rFonts w:ascii="Microsoft YaHei" w:hAnsi="Microsoft YaHei"/>
                 <w:sz w:val="20"/>
               </w:rPr>
-              <w:t>完成解释器核心，支持变量、函数、控制流、闭包</w:t>
+              <w:t>递归下降语法分析器，14 种语句 + 21 种表达式</w:t>
             </w:r>
           </w:p>
         </w:tc>
@@ -1614,7 +2806,7 @@
                 <w:rFonts w:ascii="Microsoft YaHei" w:hAnsi="Microsoft YaHei"/>
                 <w:sz w:val="20"/>
               </w:rPr>
-              <w:t>标准库扩展阶段</w:t>
+              <w:t>src/ast.rs</w:t>
             </w:r>
           </w:p>
         </w:tc>
@@ -1628,7 +2820,7 @@
                 <w:rFonts w:ascii="Microsoft YaHei" w:hAnsi="Microsoft YaHei"/>
                 <w:sz w:val="20"/>
               </w:rPr>
-              <w:t>~40</w:t>
+              <w:t>142</w:t>
             </w:r>
           </w:p>
         </w:tc>
@@ -1642,7 +2834,7 @@
                 <w:rFonts w:ascii="Microsoft YaHei" w:hAnsi="Microsoft YaHei"/>
                 <w:sz w:val="20"/>
               </w:rPr>
-              <w:t>逐步添加 Object、Array、String 等标准库方法</w:t>
+              <w:t>AST 数据结构定义</w:t>
             </w:r>
           </w:p>
         </w:tc>
@@ -1658,7 +2850,7 @@
                 <w:rFonts w:ascii="Microsoft YaHei" w:hAnsi="Microsoft YaHei"/>
                 <w:sz w:val="20"/>
               </w:rPr>
-              <w:t>Agent 接口阶段</w:t>
+              <w:t>src/value.rs</w:t>
             </w:r>
           </w:p>
         </w:tc>
@@ -1672,7 +2864,7 @@
                 <w:rFonts w:ascii="Microsoft YaHei" w:hAnsi="Microsoft YaHei"/>
                 <w:sz w:val="20"/>
               </w:rPr>
-              <w:t>~10</w:t>
+              <w:t>274</w:t>
             </w:r>
           </w:p>
         </w:tc>
@@ -1686,7 +2878,7 @@
                 <w:rFonts w:ascii="Microsoft YaHei" w:hAnsi="Microsoft YaHei"/>
                 <w:sz w:val="20"/>
               </w:rPr>
-              <w:t>实现 --agent-eval 模式、资源限制、结构化输出</w:t>
+              <w:t>运行时值模型</w:t>
             </w:r>
           </w:p>
         </w:tc>
@@ -1702,7 +2894,7 @@
                 <w:rFonts w:ascii="Microsoft YaHei" w:hAnsi="Microsoft YaHei"/>
                 <w:sz w:val="20"/>
               </w:rPr>
-              <w:t>完善与文档阶段</w:t>
+              <w:t>src/interpreter.rs</w:t>
             </w:r>
           </w:p>
         </w:tc>
@@ -1716,7 +2908,7 @@
                 <w:rFonts w:ascii="Microsoft YaHei" w:hAnsi="Microsoft YaHei"/>
                 <w:sz w:val="20"/>
               </w:rPr>
-              <w:t>~15</w:t>
+              <w:t>3201</w:t>
             </w:r>
           </w:p>
         </w:tc>
@@ -1730,12 +2922,243 @@
                 <w:rFonts w:ascii="Microsoft YaHei" w:hAnsi="Microsoft YaHei"/>
                 <w:sz w:val="20"/>
               </w:rPr>
-              <w:t>补充测试、完善文档、修复边界情况</w:t>
+              <w:t>树遍历解释器，含 80+ 内置函数</w:t>
+            </w:r>
+          </w:p>
+        </w:tc>
+      </w:tr>
+      <w:tr>
+        <w:tc>
+          <w:tcPr>
+            <w:tcW w:type="dxa" w:w="3135"/>
+          </w:tcPr>
+          <w:p>
+            <w:r>
+              <w:rPr>
+                <w:rFonts w:ascii="Microsoft YaHei" w:hAnsi="Microsoft YaHei"/>
+                <w:sz w:val="20"/>
+              </w:rPr>
+              <w:t>src/agent.rs</w:t>
+            </w:r>
+          </w:p>
+        </w:tc>
+        <w:tc>
+          <w:tcPr>
+            <w:tcW w:type="dxa" w:w="3135"/>
+          </w:tcPr>
+          <w:p>
+            <w:r>
+              <w:rPr>
+                <w:rFonts w:ascii="Microsoft YaHei" w:hAnsi="Microsoft YaHei"/>
+                <w:sz w:val="20"/>
+              </w:rPr>
+              <w:t>365</w:t>
+            </w:r>
+          </w:p>
+        </w:tc>
+        <w:tc>
+          <w:tcPr>
+            <w:tcW w:type="dxa" w:w="3135"/>
+          </w:tcPr>
+          <w:p>
+            <w:r>
+              <w:rPr>
+                <w:rFonts w:ascii="Microsoft YaHei" w:hAnsi="Microsoft YaHei"/>
+                <w:sz w:val="20"/>
+              </w:rPr>
+              <w:t>Agent 工具接口</w:t>
+            </w:r>
+          </w:p>
+        </w:tc>
+      </w:tr>
+      <w:tr>
+        <w:tc>
+          <w:tcPr>
+            <w:tcW w:type="dxa" w:w="3135"/>
+          </w:tcPr>
+          <w:p>
+            <w:r>
+              <w:rPr>
+                <w:rFonts w:ascii="Microsoft YaHei" w:hAnsi="Microsoft YaHei"/>
+                <w:sz w:val="20"/>
+              </w:rPr>
+              <w:t>src/main.rs</w:t>
+            </w:r>
+          </w:p>
+        </w:tc>
+        <w:tc>
+          <w:tcPr>
+            <w:tcW w:type="dxa" w:w="3135"/>
+          </w:tcPr>
+          <w:p>
+            <w:r>
+              <w:rPr>
+                <w:rFonts w:ascii="Microsoft YaHei" w:hAnsi="Microsoft YaHei"/>
+                <w:sz w:val="20"/>
+              </w:rPr>
+              <w:t>172</w:t>
+            </w:r>
+          </w:p>
+        </w:tc>
+        <w:tc>
+          <w:tcPr>
+            <w:tcW w:type="dxa" w:w="3135"/>
+          </w:tcPr>
+          <w:p>
+            <w:r>
+              <w:rPr>
+                <w:rFonts w:ascii="Microsoft YaHei" w:hAnsi="Microsoft YaHei"/>
+                <w:sz w:val="20"/>
+              </w:rPr>
+              <w:t>CLI 入口</w:t>
+            </w:r>
+          </w:p>
+        </w:tc>
+      </w:tr>
+      <w:tr>
+        <w:tc>
+          <w:tcPr>
+            <w:tcW w:type="dxa" w:w="3135"/>
+          </w:tcPr>
+          <w:p>
+            <w:r>
+              <w:rPr>
+                <w:rFonts w:ascii="Microsoft YaHei" w:hAnsi="Microsoft YaHei"/>
+                <w:sz w:val="20"/>
+              </w:rPr>
+              <w:t>src/lib.rs</w:t>
+            </w:r>
+          </w:p>
+        </w:tc>
+        <w:tc>
+          <w:tcPr>
+            <w:tcW w:type="dxa" w:w="3135"/>
+          </w:tcPr>
+          <w:p>
+            <w:r>
+              <w:rPr>
+                <w:rFonts w:ascii="Microsoft YaHei" w:hAnsi="Microsoft YaHei"/>
+                <w:sz w:val="20"/>
+              </w:rPr>
+              <w:t>232</w:t>
+            </w:r>
+          </w:p>
+        </w:tc>
+        <w:tc>
+          <w:tcPr>
+            <w:tcW w:type="dxa" w:w="3135"/>
+          </w:tcPr>
+          <w:p>
+            <w:r>
+              <w:rPr>
+                <w:rFonts w:ascii="Microsoft YaHei" w:hAnsi="Microsoft YaHei"/>
+                <w:sz w:val="20"/>
+              </w:rPr>
+              <w:t>库入口与公开 API</w:t>
+            </w:r>
+          </w:p>
+        </w:tc>
+      </w:tr>
+      <w:tr>
+        <w:tc>
+          <w:tcPr>
+            <w:tcW w:type="dxa" w:w="3135"/>
+          </w:tcPr>
+          <w:p>
+            <w:r>
+              <w:rPr>
+                <w:rFonts w:ascii="Microsoft YaHei" w:hAnsi="Microsoft YaHei"/>
+                <w:sz w:val="20"/>
+              </w:rPr>
+              <w:t>src/error.rs</w:t>
+            </w:r>
+          </w:p>
+        </w:tc>
+        <w:tc>
+          <w:tcPr>
+            <w:tcW w:type="dxa" w:w="3135"/>
+          </w:tcPr>
+          <w:p>
+            <w:r>
+              <w:rPr>
+                <w:rFonts w:ascii="Microsoft YaHei" w:hAnsi="Microsoft YaHei"/>
+                <w:sz w:val="20"/>
+              </w:rPr>
+              <w:t>132</w:t>
+            </w:r>
+          </w:p>
+        </w:tc>
+        <w:tc>
+          <w:tcPr>
+            <w:tcW w:type="dxa" w:w="3135"/>
+          </w:tcPr>
+          <w:p>
+            <w:r>
+              <w:rPr>
+                <w:rFonts w:ascii="Microsoft YaHei" w:hAnsi="Microsoft YaHei"/>
+                <w:sz w:val="20"/>
+              </w:rPr>
+              <w:t>错误类型系统</w:t>
+            </w:r>
+          </w:p>
+        </w:tc>
+      </w:tr>
+      <w:tr>
+        <w:tc>
+          <w:tcPr>
+            <w:tcW w:type="dxa" w:w="3135"/>
+          </w:tcPr>
+          <w:p>
+            <w:r>
+              <w:rPr>
+                <w:rFonts w:ascii="Microsoft YaHei" w:hAnsi="Microsoft YaHei"/>
+                <w:sz w:val="20"/>
+              </w:rPr>
+              <w:t>src/token.rs</w:t>
+            </w:r>
+          </w:p>
+        </w:tc>
+        <w:tc>
+          <w:tcPr>
+            <w:tcW w:type="dxa" w:w="3135"/>
+          </w:tcPr>
+          <w:p>
+            <w:r>
+              <w:rPr>
+                <w:rFonts w:ascii="Microsoft YaHei" w:hAnsi="Microsoft YaHei"/>
+                <w:sz w:val="20"/>
+              </w:rPr>
+              <w:t>114</w:t>
+            </w:r>
+          </w:p>
+        </w:tc>
+        <w:tc>
+          <w:tcPr>
+            <w:tcW w:type="dxa" w:w="3135"/>
+          </w:tcPr>
+          <w:p>
+            <w:r>
+              <w:rPr>
+                <w:rFonts w:ascii="Microsoft YaHei" w:hAnsi="Microsoft YaHei"/>
+                <w:sz w:val="20"/>
+              </w:rPr>
+              <w:t>Token 类型定义和关键字映射</w:t>
             </w:r>
           </w:p>
         </w:tc>
       </w:tr>
     </w:tbl>
+    <w:p>
+      <w:pPr>
+        <w:pStyle w:val="Heading1"/>
+      </w:pPr>
+      <w:r>
+        <w:rPr>
+          <w:rFonts w:ascii="Microsoft YaHei" w:hAnsi="Microsoft YaHei"/>
+        </w:rPr>
+        <w:t>十、比赛收获</w:t>
+      </w:r>
+    </w:p>
     <w:p>
       <w:pPr>
         <w:pStyle w:val="Heading2"/>
@@ -1744,7 +3167,7 @@
         <w:rPr>
           <w:rFonts w:ascii="Microsoft YaHei" w:hAnsi="Microsoft YaHei"/>
         </w:rPr>
-        <w:t>7.2 代码规模</w:t>
+        <w:t>10.1 技术收获</w:t>
       </w:r>
     </w:p>
     <w:p>
@@ -1755,7 +3178,7 @@
           <w:i w:val="0"/>
           <w:sz w:val="22"/>
         </w:rPr>
-        <w:t>• 源文件：10 个 Rust 模块（不含测试约 3000 行）</w:t>
+        <w:t>• 深入理解 JS 引擎原理：通过手写实现 lexer/parser/AST/解释器，深入理解 ECMA-262 规范中的词法作用域、闭包、原型链、this 绑定等核心机制。</w:t>
       </w:r>
     </w:p>
     <w:p>
@@ -1766,7 +3189,7 @@
           <w:i w:val="0"/>
           <w:sz w:val="22"/>
         </w:rPr>
-        <w:t>• 测试：各模块内置单元测试 + 集成测试</w:t>
+        <w:t>• Rust 系统编程实践：大量使用 Rc&lt;RefCell&lt;&gt;&gt; 模式，深入理解 Rust 所有权和借用检查机制。</w:t>
       </w:r>
     </w:p>
     <w:p>
@@ -1777,7 +3200,18 @@
           <w:i w:val="0"/>
           <w:sz w:val="22"/>
         </w:rPr>
-        <w:t>• 文档：README 中英文 + 3 份技术文档中英文</w:t>
+        <w:t>• 编译原理工程实践：实现完整的词法分析、语法分析、AST 遍历解释执行流水线。</w:t>
+      </w:r>
+    </w:p>
+    <w:p>
+      <w:r>
+        <w:rPr>
+          <w:rFonts w:ascii="Microsoft YaHei" w:hAnsi="Microsoft YaHei"/>
+          <w:b w:val="0"/>
+          <w:i w:val="0"/>
+          <w:sz w:val="22"/>
+        </w:rPr>
+        <w:t>• 标准库设计经验：通过实现 80+ 内置函数，积累 Object/Array/String API 设计经验。</w:t>
       </w:r>
     </w:p>
     <w:p>
@@ -1788,7 +3222,7 @@
         <w:rPr>
           <w:rFonts w:ascii="Microsoft YaHei" w:hAnsi="Microsoft YaHei"/>
         </w:rPr>
-        <w:t>7.3 经验教训</w:t>
+        <w:t>10.2 团队协作收获</w:t>
       </w:r>
     </w:p>
     <w:p>
@@ -1799,7 +3233,7 @@
           <w:i w:val="0"/>
           <w:sz w:val="22"/>
         </w:rPr>
-        <w:t>1. 从简单开始：MVP 阶段优先实现核心语法，再逐步扩展标准库。</w:t>
+        <w:t>• 实践 feature branch 工作流、代码审查、合并策略</w:t>
       </w:r>
     </w:p>
     <w:p>
@@ -1810,7 +3244,7 @@
           <w:i w:val="0"/>
           <w:sz w:val="22"/>
         </w:rPr>
-        <w:t>2. 测试先行：每个功能模块都附带单元测试，确保回归安全。</w:t>
+        <w:t>• 基于个人技术特长合理分工，提高开发效率</w:t>
       </w:r>
     </w:p>
     <w:p>
@@ -1821,7 +3255,18 @@
           <w:i w:val="0"/>
           <w:sz w:val="22"/>
         </w:rPr>
-        <w:t>3. 渐进式复杂度：先实现树遍历解释器，后续再考虑字节码编译优化。</w:t>
+        <w:t>• 通过及时沟通解决技术难题，避免重复劳动</w:t>
+      </w:r>
+    </w:p>
+    <w:p>
+      <w:pPr>
+        <w:pStyle w:val="Heading2"/>
+      </w:pPr>
+      <w:r>
+        <w:rPr>
+          <w:rFonts w:ascii="Microsoft YaHei" w:hAnsi="Microsoft YaHei"/>
+        </w:rPr>
+        <w:t>10.3 工程经验</w:t>
       </w:r>
     </w:p>
     <w:p>
@@ -1832,7 +3277,138 @@
           <w:i w:val="0"/>
           <w:sz w:val="22"/>
         </w:rPr>
-        <w:t>4. Agent 场景驱动：功能优先级由 Agent 常用脚本场景决定，而非追求完整 ECMAScript 兼容。</w:t>
+        <w:t>• 从简单开始：MVP 阶段优先实现核心语法，再逐步扩展</w:t>
+      </w:r>
+    </w:p>
+    <w:p>
+      <w:r>
+        <w:rPr>
+          <w:rFonts w:ascii="Microsoft YaHei" w:hAnsi="Microsoft YaHei"/>
+          <w:b w:val="0"/>
+          <w:i w:val="0"/>
+          <w:sz w:val="22"/>
+        </w:rPr>
+        <w:t>• 测试先行：每个功能模块附带单元测试，确保回归安全</w:t>
+      </w:r>
+    </w:p>
+    <w:p>
+      <w:r>
+        <w:rPr>
+          <w:rFonts w:ascii="Microsoft YaHei" w:hAnsi="Microsoft YaHei"/>
+          <w:b w:val="0"/>
+          <w:i w:val="0"/>
+          <w:sz w:val="22"/>
+        </w:rPr>
+        <w:t>• 渐进式复杂度：先树遍历解释器，后续再考虑字节码编译优化</w:t>
+      </w:r>
+    </w:p>
+    <w:p>
+      <w:r>
+        <w:rPr>
+          <w:rFonts w:ascii="Microsoft YaHei" w:hAnsi="Microsoft YaHei"/>
+          <w:b w:val="0"/>
+          <w:i w:val="0"/>
+          <w:sz w:val="22"/>
+        </w:rPr>
+        <w:t>• Agent 场景驱动：功能优先级由 Agent 常用脚本场景决定</w:t>
+      </w:r>
+    </w:p>
+    <w:p>
+      <w:pPr>
+        <w:pStyle w:val="Heading2"/>
+      </w:pPr>
+      <w:r>
+        <w:rPr>
+          <w:rFonts w:ascii="Microsoft YaHei" w:hAnsi="Microsoft YaHei"/>
+        </w:rPr>
+        <w:t>10.4 项目成果总结</w:t>
+      </w:r>
+    </w:p>
+    <w:p>
+      <w:r>
+        <w:rPr>
+          <w:rFonts w:ascii="Microsoft YaHei" w:hAnsi="Microsoft YaHei"/>
+          <w:b w:val="0"/>
+          <w:i w:val="0"/>
+          <w:sz w:val="22"/>
+        </w:rPr>
+        <w:t>• 87+ 次 Git 提交，10 个核心 Rust 模块</w:t>
+      </w:r>
+    </w:p>
+    <w:p>
+      <w:r>
+        <w:rPr>
+          <w:rFonts w:ascii="Microsoft YaHei" w:hAnsi="Microsoft YaHei"/>
+          <w:b w:val="0"/>
+          <w:i w:val="0"/>
+          <w:sz w:val="22"/>
+        </w:rPr>
+        <w:t>• 71 个单元测试全部通过</w:t>
+      </w:r>
+    </w:p>
+    <w:p>
+      <w:r>
+        <w:rPr>
+          <w:rFonts w:ascii="Microsoft YaHei" w:hAnsi="Microsoft YaHei"/>
+          <w:b w:val="0"/>
+          <w:i w:val="0"/>
+          <w:sz w:val="22"/>
+        </w:rPr>
+        <w:t>• 80+ 个标准库内置函数</w:t>
+      </w:r>
+    </w:p>
+    <w:p>
+      <w:r>
+        <w:rPr>
+          <w:rFonts w:ascii="Microsoft YaHei" w:hAnsi="Microsoft YaHei"/>
+          <w:b w:val="0"/>
+          <w:i w:val="0"/>
+          <w:sz w:val="22"/>
+        </w:rPr>
+        <w:t>• 零外部依赖，纯 Rust 标准库实现</w:t>
+      </w:r>
+    </w:p>
+    <w:p>
+      <w:r>
+        <w:rPr>
+          <w:rFonts w:ascii="Microsoft YaHei" w:hAnsi="Microsoft YaHei"/>
+          <w:b w:val="0"/>
+          <w:i w:val="0"/>
+          <w:sz w:val="22"/>
+        </w:rPr>
+        <w:t>• 完整中英文技术文档</w:t>
+      </w:r>
+    </w:p>
+    <w:p>
+      <w:r>
+        <w:rPr>
+          <w:rFonts w:ascii="Microsoft YaHei" w:hAnsi="Microsoft YaHei"/>
+          <w:b w:val="0"/>
+          <w:i w:val="0"/>
+          <w:sz w:val="22"/>
+        </w:rPr>
+        <w:t>• Agent 工具模式支持结构化 JSON 输出</w:t>
+      </w:r>
+    </w:p>
+    <w:p>
+      <w:r>
+        <w:rPr>
+          <w:rFonts w:ascii="Microsoft YaHei" w:hAnsi="Microsoft YaHei"/>
+          <w:b w:val="0"/>
+          <w:i w:val="0"/>
+          <w:sz w:val="22"/>
+        </w:rPr>
+      </w:r>
+    </w:p>
+    <w:p>
+      <w:r>
+        <w:rPr>
+          <w:rFonts w:ascii="Microsoft YaHei" w:hAnsi="Microsoft YaHei"/>
+          <w:b w:val="0"/>
+          <w:i/>
+          <w:sz w:val="22"/>
+        </w:rPr>
+        <w:t>文档编写日期：2026 年 6 月 30 日</w:t>
       </w:r>
     </w:p>
     <w:sectPr>

</xml_diff>

<commit_message>
docs: add project slides PDF and links
</commit_message>
<xml_diff>
--- a/docs/process/process-documentation.docx
+++ b/docs/process/process-documentation.docx
@@ -3411,6 +3411,33 @@
         <w:t>文档编写日期：2026 年 6 月 30 日</w:t>
       </w:r>
     </w:p>
+    <w:p>
+      <w:pPr>
+        <w:jc w:val="center"/>
+      </w:pPr>
+      <w:r>
+        <w:rPr>
+          <w:rFonts w:ascii="Microsoft YaHei" w:hAnsi="Microsoft YaHei"/>
+          <w:b/>
+          <w:sz w:val="32"/>
+        </w:rPr>
+        <w:t>项目幻灯片</w:t>
+      </w:r>
+    </w:p>
+    <w:p>
+      <w:pPr>
+        <w:jc w:val="center"/>
+      </w:pPr>
+      <w:r>
+        <w:rPr>
+          <w:rFonts w:ascii="Microsoft YaHei" w:hAnsi="Microsoft YaHei"/>
+          <w:color w:val="0563C1"/>
+          <w:sz w:val="24"/>
+          <w:u w:val="single"/>
+        </w:rPr>
+        <w:t>项目进展幻灯片.pdf</w:t>
+      </w:r>
+    </w:p>
     <w:sectPr>
       <w:pgSz w:w="12240" w:h="15840"/>
       <w:pgMar w:top="1417" w:right="1417" w:bottom="1417" w:left="1417" w:header="720" w:footer="720" w:gutter="0"/>

</xml_diff>